<commit_message>
Rewrite resume copy: de-duplicate sidebar, deepen executive scope
Two problems with the first pass:

1. The sidebar restated achievements already in the experience prose. The
   close metric appeared four times, the sole-leader scope three, $250M+
   three. The sidebar now carries capability, stack, and credentials only
   -- no metric appears in both columns.

2. The april section understated the role. Rebuilt from the full
   accomplishments record: ten platform implementations, first US/Israel
   consolidation, the outsourced-to-in-house accounting transition and the
   team hired behind it, the technical accounting library, risk governance,
   FP&A as an operating system, and Series C readiness.

Kisi and Prime Trust condensed to two bullets each so april keeps the depth.

Co-Authored-By: Claude Opus 5 <noreply@anthropic.com>
Claude-Session: https://claude.ai/code/session_016j5nAUmtmieWeSYgPNt7oe
</commit_message>
<xml_diff>
--- a/resume/out/Erik_Leavell_Resume.docx
+++ b/resume/out/Erik_Leavell_Resume.docx
@@ -148,7 +148,7 @@
           <w:p>
             <w:pPr>
               <w:widowControl w:val="0"/>
-              <w:spacing w:before="240" w:after="52" w:line="240" w:lineRule="auto"/>
+              <w:spacing w:before="300" w:after="52" w:line="240" w:lineRule="auto"/>
               <w:pBdr>
                 <w:bottom w:val="single" w:sz="4" w:space="2" w:color="3E5468"/>
               </w:pBdr>
@@ -163,25 +163,14 @@
                 <w:rFonts w:ascii="Liberation Sans" w:hAnsi="Liberation Sans" w:cs="Liberation Sans"/>
                 <w:spacing w:val="24"/>
               </w:rPr>
-              <w:t>CORE STRENGTHS</w:t>
+              <w:t>LEADERSHIP SCOPE</w:t>
             </w:r>
           </w:p>
           <w:p>
             <w:pPr>
               <w:widowControl w:val="0"/>
-              <w:spacing w:before="0" w:after="84" w:line="262" w:lineRule="auto"/>
+              <w:spacing w:before="0" w:after="112" w:line="266" w:lineRule="auto"/>
             </w:pPr>
-            <w:r>
-              <w:rPr>
-                <w:rFonts w:ascii="Liberation Sans" w:hAnsi="Liberation Sans"/>
-                <w:b/>
-                <w:i w:val="0"/>
-                <w:color w:val="FFFFFF"/>
-                <w:sz w:val="16"/>
-                <w:rFonts w:ascii="Liberation Sans" w:hAnsi="Liberation Sans" w:cs="Liberation Sans"/>
-              </w:rPr>
-              <w:t>Finance, end to end.</w:t>
-            </w:r>
             <w:r>
               <w:rPr>
                 <w:rFonts w:ascii="Liberation Sans" w:hAnsi="Liberation Sans"/>
@@ -191,25 +180,14 @@
                 <w:sz w:val="16"/>
                 <w:rFonts w:ascii="Liberation Sans" w:hAnsi="Liberation Sans" w:cs="Liberation Sans"/>
               </w:rPr>
-              <w:t xml:space="preserve"> Sole senior finance leader across FP&amp;A, Accounting, Revenue Operations, and Compliance.</w:t>
+              <w:t>FP&amp;A &amp; Strategic Finance</w:t>
             </w:r>
           </w:p>
           <w:p>
             <w:pPr>
               <w:widowControl w:val="0"/>
-              <w:spacing w:before="0" w:after="84" w:line="262" w:lineRule="auto"/>
+              <w:spacing w:before="0" w:after="112" w:line="266" w:lineRule="auto"/>
             </w:pPr>
-            <w:r>
-              <w:rPr>
-                <w:rFonts w:ascii="Liberation Sans" w:hAnsi="Liberation Sans"/>
-                <w:b/>
-                <w:i w:val="0"/>
-                <w:color w:val="FFFFFF"/>
-                <w:sz w:val="16"/>
-                <w:rFonts w:ascii="Liberation Sans" w:hAnsi="Liberation Sans" w:cs="Liberation Sans"/>
-              </w:rPr>
-              <w:t>Close &amp; controllership.</w:t>
-            </w:r>
             <w:r>
               <w:rPr>
                 <w:rFonts w:ascii="Liberation Sans" w:hAnsi="Liberation Sans"/>
@@ -219,25 +197,14 @@
                 <w:sz w:val="16"/>
                 <w:rFonts w:ascii="Liberation Sans" w:hAnsi="Liberation Sans" w:cs="Liberation Sans"/>
               </w:rPr>
-              <w:t xml:space="preserve"> 31-day close to 5; back-to-back clean KPMG audits.</w:t>
+              <w:t>Accounting &amp; Controllership</w:t>
             </w:r>
           </w:p>
           <w:p>
             <w:pPr>
               <w:widowControl w:val="0"/>
-              <w:spacing w:before="0" w:after="84" w:line="262" w:lineRule="auto"/>
+              <w:spacing w:before="0" w:after="112" w:line="266" w:lineRule="auto"/>
             </w:pPr>
-            <w:r>
-              <w:rPr>
-                <w:rFonts w:ascii="Liberation Sans" w:hAnsi="Liberation Sans"/>
-                <w:b/>
-                <w:i w:val="0"/>
-                <w:color w:val="FFFFFF"/>
-                <w:sz w:val="16"/>
-                <w:rFonts w:ascii="Liberation Sans" w:hAnsi="Liberation Sans" w:cs="Liberation Sans"/>
-              </w:rPr>
-              <w:t>Audit &amp; compliance.</w:t>
-            </w:r>
             <w:r>
               <w:rPr>
                 <w:rFonts w:ascii="Liberation Sans" w:hAnsi="Liberation Sans"/>
@@ -247,25 +214,14 @@
                 <w:sz w:val="16"/>
                 <w:rFonts w:ascii="Liberation Sans" w:hAnsi="Liberation Sans" w:cs="Liberation Sans"/>
               </w:rPr>
-              <w:t xml:space="preserve"> SOC 1 owner, SOC 2 Type II support, enterprise security diligence.</w:t>
+              <w:t>Technical Accounting &amp; Rev Rec</w:t>
             </w:r>
           </w:p>
           <w:p>
             <w:pPr>
               <w:widowControl w:val="0"/>
-              <w:spacing w:before="0" w:after="84" w:line="262" w:lineRule="auto"/>
+              <w:spacing w:before="0" w:after="112" w:line="266" w:lineRule="auto"/>
             </w:pPr>
-            <w:r>
-              <w:rPr>
-                <w:rFonts w:ascii="Liberation Sans" w:hAnsi="Liberation Sans"/>
-                <w:b/>
-                <w:i w:val="0"/>
-                <w:color w:val="FFFFFF"/>
-                <w:sz w:val="16"/>
-                <w:rFonts w:ascii="Liberation Sans" w:hAnsi="Liberation Sans" w:cs="Liberation Sans"/>
-              </w:rPr>
-              <w:t>Capital &amp; investor relations.</w:t>
-            </w:r>
             <w:r>
               <w:rPr>
                 <w:rFonts w:ascii="Liberation Sans" w:hAnsi="Liberation Sans"/>
@@ -275,25 +231,14 @@
                 <w:sz w:val="16"/>
                 <w:rFonts w:ascii="Liberation Sans" w:hAnsi="Liberation Sans" w:cs="Liberation Sans"/>
               </w:rPr>
-              <w:t xml:space="preserve"> $250M+ raised across Series B and C rounds.</w:t>
+              <w:t>Audit, SOC &amp; Risk Governance</w:t>
             </w:r>
           </w:p>
           <w:p>
             <w:pPr>
               <w:widowControl w:val="0"/>
-              <w:spacing w:before="0" w:after="84" w:line="262" w:lineRule="auto"/>
+              <w:spacing w:before="0" w:after="112" w:line="266" w:lineRule="auto"/>
             </w:pPr>
-            <w:r>
-              <w:rPr>
-                <w:rFonts w:ascii="Liberation Sans" w:hAnsi="Liberation Sans"/>
-                <w:b/>
-                <w:i w:val="0"/>
-                <w:color w:val="FFFFFF"/>
-                <w:sz w:val="16"/>
-                <w:rFonts w:ascii="Liberation Sans" w:hAnsi="Liberation Sans" w:cs="Liberation Sans"/>
-              </w:rPr>
-              <w:t>AI-native operator.</w:t>
-            </w:r>
             <w:r>
               <w:rPr>
                 <w:rFonts w:ascii="Liberation Sans" w:hAnsi="Liberation Sans"/>
@@ -303,25 +248,14 @@
                 <w:sz w:val="16"/>
                 <w:rFonts w:ascii="Liberation Sans" w:hAnsi="Liberation Sans" w:cs="Liberation Sans"/>
               </w:rPr>
-              <w:t xml:space="preserve"> Builds agent systems on the finance stack so scale doesn't require headcount.</w:t>
+              <w:t>Tax &amp; Multi-Entity Compliance</w:t>
             </w:r>
           </w:p>
           <w:p>
             <w:pPr>
               <w:widowControl w:val="0"/>
-              <w:spacing w:before="0" w:after="84" w:line="262" w:lineRule="auto"/>
+              <w:spacing w:before="0" w:after="112" w:line="266" w:lineRule="auto"/>
             </w:pPr>
-            <w:r>
-              <w:rPr>
-                <w:rFonts w:ascii="Liberation Sans" w:hAnsi="Liberation Sans"/>
-                <w:b/>
-                <w:i w:val="0"/>
-                <w:color w:val="FFFFFF"/>
-                <w:sz w:val="16"/>
-                <w:rFonts w:ascii="Liberation Sans" w:hAnsi="Liberation Sans" w:cs="Liberation Sans"/>
-              </w:rPr>
-              <w:t>SaaS metrics.</w:t>
-            </w:r>
             <w:r>
               <w:rPr>
                 <w:rFonts w:ascii="Liberation Sans" w:hAnsi="Liberation Sans"/>
@@ -331,13 +265,98 @@
                 <w:sz w:val="16"/>
                 <w:rFonts w:ascii="Liberation Sans" w:hAnsi="Liberation Sans" w:cs="Liberation Sans"/>
               </w:rPr>
-              <w:t xml:space="preserve"> ARR, CARR, unit economics, and rolling forecasts.</w:t>
+              <w:t>Treasury &amp; Working Capital</w:t>
             </w:r>
           </w:p>
           <w:p>
             <w:pPr>
               <w:widowControl w:val="0"/>
-              <w:spacing w:before="240" w:after="52" w:line="240" w:lineRule="auto"/>
+              <w:spacing w:before="0" w:after="112" w:line="266" w:lineRule="auto"/>
+            </w:pPr>
+            <w:r>
+              <w:rPr>
+                <w:rFonts w:ascii="Liberation Sans" w:hAnsi="Liberation Sans"/>
+                <w:b w:val="0"/>
+                <w:i w:val="0"/>
+                <w:color w:val="D9E2EC"/>
+                <w:sz w:val="16"/>
+                <w:rFonts w:ascii="Liberation Sans" w:hAnsi="Liberation Sans" w:cs="Liberation Sans"/>
+              </w:rPr>
+              <w:t>Investor Relations &amp; Board Reporting</w:t>
+            </w:r>
+          </w:p>
+          <w:p>
+            <w:pPr>
+              <w:widowControl w:val="0"/>
+              <w:spacing w:before="0" w:after="112" w:line="266" w:lineRule="auto"/>
+            </w:pPr>
+            <w:r>
+              <w:rPr>
+                <w:rFonts w:ascii="Liberation Sans" w:hAnsi="Liberation Sans"/>
+                <w:b w:val="0"/>
+                <w:i w:val="0"/>
+                <w:color w:val="D9E2EC"/>
+                <w:sz w:val="16"/>
+                <w:rFonts w:ascii="Liberation Sans" w:hAnsi="Liberation Sans" w:cs="Liberation Sans"/>
+              </w:rPr>
+              <w:t>Global Consolidation (US / Israel)</w:t>
+            </w:r>
+          </w:p>
+          <w:p>
+            <w:pPr>
+              <w:widowControl w:val="0"/>
+              <w:spacing w:before="0" w:after="112" w:line="266" w:lineRule="auto"/>
+            </w:pPr>
+            <w:r>
+              <w:rPr>
+                <w:rFonts w:ascii="Liberation Sans" w:hAnsi="Liberation Sans"/>
+                <w:b w:val="0"/>
+                <w:i w:val="0"/>
+                <w:color w:val="D9E2EC"/>
+                <w:sz w:val="16"/>
+                <w:rFonts w:ascii="Liberation Sans" w:hAnsi="Liberation Sans" w:cs="Liberation Sans"/>
+              </w:rPr>
+              <w:t>Procurement &amp; Vendor Strategy</w:t>
+            </w:r>
+          </w:p>
+          <w:p>
+            <w:pPr>
+              <w:widowControl w:val="0"/>
+              <w:spacing w:before="0" w:after="112" w:line="266" w:lineRule="auto"/>
+            </w:pPr>
+            <w:r>
+              <w:rPr>
+                <w:rFonts w:ascii="Liberation Sans" w:hAnsi="Liberation Sans"/>
+                <w:b w:val="0"/>
+                <w:i w:val="0"/>
+                <w:color w:val="D9E2EC"/>
+                <w:sz w:val="16"/>
+                <w:rFonts w:ascii="Liberation Sans" w:hAnsi="Liberation Sans" w:cs="Liberation Sans"/>
+              </w:rPr>
+              <w:t>Team Building, Comp &amp; Leveling</w:t>
+            </w:r>
+          </w:p>
+          <w:p>
+            <w:pPr>
+              <w:widowControl w:val="0"/>
+              <w:spacing w:before="0" w:after="112" w:line="266" w:lineRule="auto"/>
+            </w:pPr>
+            <w:r>
+              <w:rPr>
+                <w:rFonts w:ascii="Liberation Sans" w:hAnsi="Liberation Sans"/>
+                <w:b w:val="0"/>
+                <w:i w:val="0"/>
+                <w:color w:val="D9E2EC"/>
+                <w:sz w:val="16"/>
+                <w:rFonts w:ascii="Liberation Sans" w:hAnsi="Liberation Sans" w:cs="Liberation Sans"/>
+              </w:rPr>
+              <w:t>AI &amp; Finance Automation</w:t>
+            </w:r>
+          </w:p>
+          <w:p>
+            <w:pPr>
+              <w:widowControl w:val="0"/>
+              <w:spacing w:before="300" w:after="52" w:line="240" w:lineRule="auto"/>
               <w:pBdr>
                 <w:bottom w:val="single" w:sz="4" w:space="2" w:color="3E5468"/>
               </w:pBdr>
@@ -358,7 +377,7 @@
           <w:p>
             <w:pPr>
               <w:widowControl w:val="0"/>
-              <w:spacing w:before="0" w:after="84" w:line="262" w:lineRule="auto"/>
+              <w:spacing w:before="0" w:after="112" w:line="266" w:lineRule="auto"/>
             </w:pPr>
             <w:r>
               <w:rPr>
@@ -380,13 +399,13 @@
                 <w:sz w:val="16"/>
                 <w:rFonts w:ascii="Liberation Sans" w:hAnsi="Liberation Sans" w:cs="Liberation Sans"/>
               </w:rPr>
-              <w:t xml:space="preserve"> Campfire, NetSuite, Sage Intacct, QuickBooks, Xero</w:t>
+              <w:t xml:space="preserve"> Campfire, NetSuite, Sage Intacct, Numeric, QuickBooks</w:t>
             </w:r>
           </w:p>
           <w:p>
             <w:pPr>
               <w:widowControl w:val="0"/>
-              <w:spacing w:before="0" w:after="84" w:line="262" w:lineRule="auto"/>
+              <w:spacing w:before="0" w:after="112" w:line="266" w:lineRule="auto"/>
             </w:pPr>
             <w:r>
               <w:rPr>
@@ -408,13 +427,13 @@
                 <w:sz w:val="16"/>
                 <w:rFonts w:ascii="Liberation Sans" w:hAnsi="Liberation Sans" w:cs="Liberation Sans"/>
               </w:rPr>
-              <w:t xml:space="preserve"> Drivetrain, Planful, Anaplan, Pigment, Runway</w:t>
+              <w:t xml:space="preserve"> Runway, Drivetrain, Planful, Anaplan, Pigment</w:t>
             </w:r>
           </w:p>
           <w:p>
             <w:pPr>
               <w:widowControl w:val="0"/>
-              <w:spacing w:before="0" w:after="84" w:line="262" w:lineRule="auto"/>
+              <w:spacing w:before="0" w:after="112" w:line="266" w:lineRule="auto"/>
             </w:pPr>
             <w:r>
               <w:rPr>
@@ -436,13 +455,13 @@
                 <w:sz w:val="16"/>
                 <w:rFonts w:ascii="Liberation Sans" w:hAnsi="Liberation Sans" w:cs="Liberation Sans"/>
               </w:rPr>
-              <w:t xml:space="preserve"> Ramp, Zip, Brex</w:t>
+              <w:t xml:space="preserve"> Ramp, Zip, Brex, Bill.com</w:t>
             </w:r>
           </w:p>
           <w:p>
             <w:pPr>
               <w:widowControl w:val="0"/>
-              <w:spacing w:before="0" w:after="84" w:line="262" w:lineRule="auto"/>
+              <w:spacing w:before="0" w:after="112" w:line="266" w:lineRule="auto"/>
             </w:pPr>
             <w:r>
               <w:rPr>
@@ -453,7 +472,7 @@
                 <w:sz w:val="16"/>
                 <w:rFonts w:ascii="Liberation Sans" w:hAnsi="Liberation Sans" w:cs="Liberation Sans"/>
               </w:rPr>
-              <w:t>Billing &amp; RevRec</w:t>
+              <w:t>Billing &amp; Rev Rec</w:t>
             </w:r>
             <w:r>
               <w:rPr>
@@ -464,13 +483,13 @@
                 <w:sz w:val="16"/>
                 <w:rFonts w:ascii="Liberation Sans" w:hAnsi="Liberation Sans" w:cs="Liberation Sans"/>
               </w:rPr>
-              <w:t xml:space="preserve"> Campfire, Tabs, Maxio, Chargebee, Stripe</w:t>
+              <w:t xml:space="preserve"> Campfire, Growfin, Chargebee, Stripe, Maxio, Tabs</w:t>
             </w:r>
           </w:p>
           <w:p>
             <w:pPr>
               <w:widowControl w:val="0"/>
-              <w:spacing w:before="0" w:after="84" w:line="262" w:lineRule="auto"/>
+              <w:spacing w:before="0" w:after="112" w:line="266" w:lineRule="auto"/>
             </w:pPr>
             <w:r>
               <w:rPr>
@@ -481,7 +500,7 @@
                 <w:sz w:val="16"/>
                 <w:rFonts w:ascii="Liberation Sans" w:hAnsi="Liberation Sans" w:cs="Liberation Sans"/>
               </w:rPr>
-              <w:t>Compliance</w:t>
+              <w:t>Tax</w:t>
             </w:r>
             <w:r>
               <w:rPr>
@@ -492,13 +511,69 @@
                 <w:sz w:val="16"/>
                 <w:rFonts w:ascii="Liberation Sans" w:hAnsi="Liberation Sans" w:cs="Liberation Sans"/>
               </w:rPr>
-              <w:t xml:space="preserve"> Drata, Thoropass</w:t>
+              <w:t xml:space="preserve"> Anrok, Neo.Tax, Sphere</w:t>
             </w:r>
           </w:p>
           <w:p>
             <w:pPr>
               <w:widowControl w:val="0"/>
-              <w:spacing w:before="0" w:after="84" w:line="262" w:lineRule="auto"/>
+              <w:spacing w:before="0" w:after="112" w:line="266" w:lineRule="auto"/>
+            </w:pPr>
+            <w:r>
+              <w:rPr>
+                <w:rFonts w:ascii="Liberation Sans" w:hAnsi="Liberation Sans"/>
+                <w:b/>
+                <w:i w:val="0"/>
+                <w:color w:val="FFFFFF"/>
+                <w:sz w:val="16"/>
+                <w:rFonts w:ascii="Liberation Sans" w:hAnsi="Liberation Sans" w:cs="Liberation Sans"/>
+              </w:rPr>
+              <w:t>Compliance &amp; GRC</w:t>
+            </w:r>
+            <w:r>
+              <w:rPr>
+                <w:rFonts w:ascii="Liberation Sans" w:hAnsi="Liberation Sans"/>
+                <w:b w:val="0"/>
+                <w:i w:val="0"/>
+                <w:color w:val="D9E2EC"/>
+                <w:sz w:val="16"/>
+                <w:rFonts w:ascii="Liberation Sans" w:hAnsi="Liberation Sans" w:cs="Liberation Sans"/>
+              </w:rPr>
+              <w:t xml:space="preserve"> Thoropass, Safebase, Drata</w:t>
+            </w:r>
+          </w:p>
+          <w:p>
+            <w:pPr>
+              <w:widowControl w:val="0"/>
+              <w:spacing w:before="0" w:after="112" w:line="266" w:lineRule="auto"/>
+            </w:pPr>
+            <w:r>
+              <w:rPr>
+                <w:rFonts w:ascii="Liberation Sans" w:hAnsi="Liberation Sans"/>
+                <w:b/>
+                <w:i w:val="0"/>
+                <w:color w:val="FFFFFF"/>
+                <w:sz w:val="16"/>
+                <w:rFonts w:ascii="Liberation Sans" w:hAnsi="Liberation Sans" w:cs="Liberation Sans"/>
+              </w:rPr>
+              <w:t>People &amp; Equity</w:t>
+            </w:r>
+            <w:r>
+              <w:rPr>
+                <w:rFonts w:ascii="Liberation Sans" w:hAnsi="Liberation Sans"/>
+                <w:b w:val="0"/>
+                <w:i w:val="0"/>
+                <w:color w:val="D9E2EC"/>
+                <w:sz w:val="16"/>
+                <w:rFonts w:ascii="Liberation Sans" w:hAnsi="Liberation Sans" w:cs="Liberation Sans"/>
+              </w:rPr>
+              <w:t xml:space="preserve"> Justworks, Carta, Rippling, QuotaPath, Guideline</w:t>
+            </w:r>
+          </w:p>
+          <w:p>
+            <w:pPr>
+              <w:widowControl w:val="0"/>
+              <w:spacing w:before="0" w:after="112" w:line="266" w:lineRule="auto"/>
             </w:pPr>
             <w:r>
               <w:rPr>
@@ -526,224 +601,7 @@
           <w:p>
             <w:pPr>
               <w:widowControl w:val="0"/>
-              <w:spacing w:before="0" w:after="84" w:line="262" w:lineRule="auto"/>
-            </w:pPr>
-            <w:r>
-              <w:rPr>
-                <w:rFonts w:ascii="Liberation Sans" w:hAnsi="Liberation Sans"/>
-                <w:b/>
-                <w:i w:val="0"/>
-                <w:color w:val="FFFFFF"/>
-                <w:sz w:val="16"/>
-                <w:rFonts w:ascii="Liberation Sans" w:hAnsi="Liberation Sans" w:cs="Liberation Sans"/>
-              </w:rPr>
-              <w:t>Tax</w:t>
-            </w:r>
-            <w:r>
-              <w:rPr>
-                <w:rFonts w:ascii="Liberation Sans" w:hAnsi="Liberation Sans"/>
-                <w:b w:val="0"/>
-                <w:i w:val="0"/>
-                <w:color w:val="D9E2EC"/>
-                <w:sz w:val="16"/>
-                <w:rFonts w:ascii="Liberation Sans" w:hAnsi="Liberation Sans" w:cs="Liberation Sans"/>
-              </w:rPr>
-              <w:t xml:space="preserve"> Neo.Tax, Anrok, Sphere</w:t>
-            </w:r>
-          </w:p>
-          <w:p>
-            <w:pPr>
-              <w:widowControl w:val="0"/>
-              <w:spacing w:before="240" w:after="52" w:line="240" w:lineRule="auto"/>
-              <w:pBdr>
-                <w:bottom w:val="single" w:sz="4" w:space="2" w:color="3E5468"/>
-              </w:pBdr>
-            </w:pPr>
-            <w:r>
-              <w:rPr>
-                <w:rFonts w:ascii="Liberation Sans" w:hAnsi="Liberation Sans"/>
-                <w:b/>
-                <w:i w:val="0"/>
-                <w:color w:val="7FB3D9"/>
-                <w:sz w:val="16"/>
-                <w:rFonts w:ascii="Liberation Sans" w:hAnsi="Liberation Sans" w:cs="Liberation Sans"/>
-                <w:spacing w:val="24"/>
-              </w:rPr>
-              <w:t>BY THE NUMBERS</w:t>
-            </w:r>
-          </w:p>
-          <w:p>
-            <w:pPr>
-              <w:widowControl w:val="0"/>
-              <w:spacing w:before="0" w:after="84" w:line="262" w:lineRule="auto"/>
-            </w:pPr>
-            <w:r>
-              <w:rPr>
-                <w:rFonts w:ascii="Liberation Sans" w:hAnsi="Liberation Sans"/>
-                <w:b/>
-                <w:i w:val="0"/>
-                <w:color w:val="FFFFFF"/>
-                <w:sz w:val="16"/>
-                <w:rFonts w:ascii="Liberation Sans" w:hAnsi="Liberation Sans" w:cs="Liberation Sans"/>
-              </w:rPr>
-              <w:t>31 → 5 days</w:t>
-            </w:r>
-            <w:r>
-              <w:rPr>
-                <w:rFonts w:ascii="Liberation Sans" w:hAnsi="Liberation Sans"/>
-                <w:b w:val="0"/>
-                <w:i w:val="0"/>
-                <w:color w:val="D9E2EC"/>
-                <w:sz w:val="16"/>
-                <w:rFonts w:ascii="Liberation Sans" w:hAnsi="Liberation Sans" w:cs="Liberation Sans"/>
-              </w:rPr>
-              <w:t xml:space="preserve"> month-end close</w:t>
-            </w:r>
-          </w:p>
-          <w:p>
-            <w:pPr>
-              <w:widowControl w:val="0"/>
-              <w:spacing w:before="0" w:after="84" w:line="262" w:lineRule="auto"/>
-            </w:pPr>
-            <w:r>
-              <w:rPr>
-                <w:rFonts w:ascii="Liberation Sans" w:hAnsi="Liberation Sans"/>
-                <w:b/>
-                <w:i w:val="0"/>
-                <w:color w:val="FFFFFF"/>
-                <w:sz w:val="16"/>
-                <w:rFonts w:ascii="Liberation Sans" w:hAnsi="Liberation Sans" w:cs="Liberation Sans"/>
-              </w:rPr>
-              <w:t>2 consecutive</w:t>
-            </w:r>
-            <w:r>
-              <w:rPr>
-                <w:rFonts w:ascii="Liberation Sans" w:hAnsi="Liberation Sans"/>
-                <w:b w:val="0"/>
-                <w:i w:val="0"/>
-                <w:color w:val="D9E2EC"/>
-                <w:sz w:val="16"/>
-                <w:rFonts w:ascii="Liberation Sans" w:hAnsi="Liberation Sans" w:cs="Liberation Sans"/>
-              </w:rPr>
-              <w:t xml:space="preserve"> clean KPMG audits</w:t>
-            </w:r>
-          </w:p>
-          <w:p>
-            <w:pPr>
-              <w:widowControl w:val="0"/>
-              <w:spacing w:before="0" w:after="84" w:line="262" w:lineRule="auto"/>
-            </w:pPr>
-            <w:r>
-              <w:rPr>
-                <w:rFonts w:ascii="Liberation Sans" w:hAnsi="Liberation Sans"/>
-                <w:b/>
-                <w:i w:val="0"/>
-                <w:color w:val="FFFFFF"/>
-                <w:sz w:val="16"/>
-                <w:rFonts w:ascii="Liberation Sans" w:hAnsi="Liberation Sans" w:cs="Liberation Sans"/>
-              </w:rPr>
-              <w:t>$250M+</w:t>
-            </w:r>
-            <w:r>
-              <w:rPr>
-                <w:rFonts w:ascii="Liberation Sans" w:hAnsi="Liberation Sans"/>
-                <w:b w:val="0"/>
-                <w:i w:val="0"/>
-                <w:color w:val="D9E2EC"/>
-                <w:sz w:val="16"/>
-                <w:rFonts w:ascii="Liberation Sans" w:hAnsi="Liberation Sans" w:cs="Liberation Sans"/>
-              </w:rPr>
-              <w:t xml:space="preserve"> raised across Series B and C</w:t>
-            </w:r>
-          </w:p>
-          <w:p>
-            <w:pPr>
-              <w:widowControl w:val="0"/>
-              <w:spacing w:before="0" w:after="84" w:line="262" w:lineRule="auto"/>
-            </w:pPr>
-            <w:r>
-              <w:rPr>
-                <w:rFonts w:ascii="Liberation Sans" w:hAnsi="Liberation Sans"/>
-                <w:b/>
-                <w:i w:val="0"/>
-                <w:color w:val="FFFFFF"/>
-                <w:sz w:val="16"/>
-                <w:rFonts w:ascii="Liberation Sans" w:hAnsi="Liberation Sans" w:cs="Liberation Sans"/>
-              </w:rPr>
-              <w:t>+25% valuation</w:t>
-            </w:r>
-            <w:r>
-              <w:rPr>
-                <w:rFonts w:ascii="Liberation Sans" w:hAnsi="Liberation Sans"/>
-                <w:b w:val="0"/>
-                <w:i w:val="0"/>
-                <w:color w:val="D9E2EC"/>
-                <w:sz w:val="16"/>
-                <w:rFonts w:ascii="Liberation Sans" w:hAnsi="Liberation Sans" w:cs="Liberation Sans"/>
-              </w:rPr>
-              <w:t xml:space="preserve"> and 6–8 months of runway</w:t>
-            </w:r>
-          </w:p>
-          <w:p>
-            <w:pPr>
-              <w:widowControl w:val="0"/>
-              <w:spacing w:before="0" w:after="84" w:line="262" w:lineRule="auto"/>
-            </w:pPr>
-            <w:r>
-              <w:rPr>
-                <w:rFonts w:ascii="Liberation Sans" w:hAnsi="Liberation Sans"/>
-                <w:b/>
-                <w:i w:val="0"/>
-                <w:color w:val="FFFFFF"/>
-                <w:sz w:val="16"/>
-                <w:rFonts w:ascii="Liberation Sans" w:hAnsi="Liberation Sans" w:cs="Liberation Sans"/>
-              </w:rPr>
-              <w:t>$100M → $1B</w:t>
-            </w:r>
-            <w:r>
-              <w:rPr>
-                <w:rFonts w:ascii="Liberation Sans" w:hAnsi="Liberation Sans"/>
-                <w:b w:val="0"/>
-                <w:i w:val="0"/>
-                <w:color w:val="D9E2EC"/>
-                <w:sz w:val="16"/>
-                <w:rFonts w:ascii="Liberation Sans" w:hAnsi="Liberation Sans" w:cs="Liberation Sans"/>
-              </w:rPr>
-              <w:t xml:space="preserve"> revenue scale-up at MightyHive</w:t>
-            </w:r>
-          </w:p>
-          <w:p>
-            <w:pPr>
-              <w:widowControl w:val="0"/>
-              <w:spacing w:before="0" w:after="84" w:line="262" w:lineRule="auto"/>
-            </w:pPr>
-            <w:r>
-              <w:rPr>
-                <w:rFonts w:ascii="Liberation Sans" w:hAnsi="Liberation Sans"/>
-                <w:b/>
-                <w:i w:val="0"/>
-                <w:color w:val="FFFFFF"/>
-                <w:sz w:val="16"/>
-                <w:rFonts w:ascii="Liberation Sans" w:hAnsi="Liberation Sans" w:cs="Liberation Sans"/>
-              </w:rPr>
-              <w:t>−72% AR days</w:t>
-            </w:r>
-            <w:r>
-              <w:rPr>
-                <w:rFonts w:ascii="Liberation Sans" w:hAnsi="Liberation Sans"/>
-                <w:b w:val="0"/>
-                <w:i w:val="0"/>
-                <w:color w:val="D9E2EC"/>
-                <w:sz w:val="16"/>
-                <w:rFonts w:ascii="Liberation Sans" w:hAnsi="Liberation Sans" w:cs="Liberation Sans"/>
-              </w:rPr>
-              <w:t xml:space="preserve"> at Harvard Eye Associates</w:t>
-            </w:r>
-          </w:p>
-          <w:p>
-            <w:pPr>
-              <w:widowControl w:val="0"/>
-              <w:spacing w:before="240" w:after="52" w:line="240" w:lineRule="auto"/>
+              <w:spacing w:before="300" w:after="52" w:line="240" w:lineRule="auto"/>
               <w:pBdr>
                 <w:bottom w:val="single" w:sz="4" w:space="2" w:color="3E5468"/>
               </w:pBdr>
@@ -764,7 +622,7 @@
           <w:p>
             <w:pPr>
               <w:widowControl w:val="0"/>
-              <w:spacing w:before="0" w:after="84" w:line="262" w:lineRule="auto"/>
+              <w:spacing w:before="0" w:after="112" w:line="266" w:lineRule="auto"/>
             </w:pPr>
             <w:r>
               <w:rPr>
@@ -781,7 +639,7 @@
           <w:p>
             <w:pPr>
               <w:widowControl w:val="0"/>
-              <w:spacing w:before="0" w:after="84" w:line="262" w:lineRule="auto"/>
+              <w:spacing w:before="0" w:after="112" w:line="266" w:lineRule="auto"/>
             </w:pPr>
             <w:r>
               <w:rPr>
@@ -798,7 +656,7 @@
           <w:p>
             <w:pPr>
               <w:widowControl w:val="0"/>
-              <w:spacing w:before="240" w:after="52" w:line="240" w:lineRule="auto"/>
+              <w:spacing w:before="300" w:after="52" w:line="240" w:lineRule="auto"/>
               <w:pBdr>
                 <w:bottom w:val="single" w:sz="4" w:space="2" w:color="3E5468"/>
               </w:pBdr>
@@ -819,7 +677,7 @@
           <w:p>
             <w:pPr>
               <w:widowControl w:val="0"/>
-              <w:spacing w:before="0" w:after="84" w:line="262" w:lineRule="auto"/>
+              <w:spacing w:before="0" w:after="112" w:line="266" w:lineRule="auto"/>
             </w:pPr>
             <w:r>
               <w:rPr>
@@ -836,7 +694,7 @@
           <w:p>
             <w:pPr>
               <w:widowControl w:val="0"/>
-              <w:spacing w:before="0" w:after="84" w:line="262" w:lineRule="auto"/>
+              <w:spacing w:before="0" w:after="112" w:line="266" w:lineRule="auto"/>
             </w:pPr>
             <w:r>
               <w:rPr>
@@ -875,7 +733,7 @@
                 <w:b/>
                 <w:i w:val="0"/>
                 <w:color w:val="1B2735"/>
-                <w:sz w:val="18"/>
+                <w:sz w:val="17"/>
                 <w:rFonts w:ascii="Liberation Sans" w:hAnsi="Liberation Sans" w:cs="Liberation Sans"/>
                 <w:spacing w:val="30"/>
               </w:rPr>
@@ -885,7 +743,7 @@
           <w:p>
             <w:pPr>
               <w:widowControl w:val="0"/>
-              <w:spacing w:before="0" w:after="0" w:line="269" w:lineRule="auto"/>
+              <w:spacing w:before="0" w:after="0" w:line="254" w:lineRule="auto"/>
               <w:jc w:val="both"/>
             </w:pPr>
             <w:r>
@@ -894,16 +752,16 @@
                 <w:b w:val="0"/>
                 <w:i w:val="0"/>
                 <w:color w:val="2E3A46"/>
-                <w:sz w:val="18"/>
+                <w:sz w:val="17"/>
                 <w:rFonts w:ascii="Liberation Sans" w:hAnsi="Liberation Sans" w:cs="Liberation Sans"/>
               </w:rPr>
-              <w:t>Finance executive with 10+ years building and owning the finance function end to end at high-growth SaaS and fintech companies. Sole senior finance leader at april, owning FP&amp;A, Accounting, Revenue Operations, and Compliance. I stand up GAAP accounting, forecasting, board reporting, and audit-ready governance from scratch, have supported $250M+ raised across Series B and C, and build AI agent systems on the finance stack so it scales without adding headcount.</w:t>
+              <w:t>Finance executive who builds finance functions that scale. I run FP&amp;A, Accounting, Revenue Operations, and Compliance at april as its sole senior finance leader — a function I built from zero as the company's first finance hire. Ten-plus years across SaaS and fintech: GAAP accounting and audit-ready governance stood up from scratch, global consolidations delivered, $250M+ in capital supported, and manual, vendor-dependent operations replaced with automated systems that run leaner than the headcount they displace.</w:t>
             </w:r>
           </w:p>
           <w:p>
             <w:pPr>
               <w:widowControl w:val="0"/>
-              <w:spacing w:before="220" w:after="68" w:line="240" w:lineRule="auto"/>
+              <w:spacing w:before="160" w:after="68" w:line="240" w:lineRule="auto"/>
               <w:pBdr>
                 <w:bottom w:val="single" w:sz="6" w:space="2" w:color="C3CDD7"/>
               </w:pBdr>
@@ -914,7 +772,7 @@
                 <w:b/>
                 <w:i w:val="0"/>
                 <w:color w:val="1B2735"/>
-                <w:sz w:val="18"/>
+                <w:sz w:val="17"/>
                 <w:rFonts w:ascii="Liberation Sans" w:hAnsi="Liberation Sans" w:cs="Liberation Sans"/>
                 <w:spacing w:val="30"/>
               </w:rPr>
@@ -935,7 +793,7 @@
                 <w:b/>
                 <w:i w:val="0"/>
                 <w:color w:val="1B2735"/>
-                <w:sz w:val="20"/>
+                <w:sz w:val="19"/>
                 <w:rFonts w:ascii="Liberation Sans" w:hAnsi="Liberation Sans" w:cs="Liberation Sans"/>
               </w:rPr>
               <w:t>Director of Finance</w:t>
@@ -946,7 +804,7 @@
                 <w:b w:val="0"/>
                 <w:i w:val="0"/>
                 <w:color w:val="2E3A46"/>
-                <w:sz w:val="20"/>
+                <w:sz w:val="19"/>
                 <w:rFonts w:ascii="Liberation Sans" w:hAnsi="Liberation Sans" w:cs="Liberation Sans"/>
               </w:rPr>
               <w:t xml:space="preserve">  ·  april</w:t>
@@ -957,7 +815,7 @@
                 <w:b w:val="0"/>
                 <w:i w:val="0"/>
                 <w:color w:val="5B6B7B"/>
-                <w:sz w:val="16"/>
+                <w:sz w:val="15"/>
                 <w:rFonts w:ascii="Liberation Sans" w:hAnsi="Liberation Sans" w:cs="Liberation Sans"/>
               </w:rPr>
               <w:tab/>
@@ -967,7 +825,7 @@
           <w:p>
             <w:pPr>
               <w:widowControl w:val="0"/>
-              <w:spacing w:before="0" w:after="64" w:line="269" w:lineRule="auto"/>
+              <w:spacing w:before="0" w:after="48" w:line="254" w:lineRule="auto"/>
               <w:ind w:left="187" w:hanging="187"/>
             </w:pPr>
             <w:r>
@@ -976,7 +834,7 @@
                 <w:b w:val="0"/>
                 <w:i w:val="0"/>
                 <w:color w:val="2E3A46"/>
-                <w:sz w:val="18"/>
+                <w:sz w:val="17"/>
                 <w:rFonts w:ascii="Liberation Sans" w:hAnsi="Liberation Sans" w:cs="Liberation Sans"/>
               </w:rPr>
               <w:t xml:space="preserve">– </w:t>
@@ -984,30 +842,19 @@
             <w:r>
               <w:rPr>
                 <w:rFonts w:ascii="Liberation Sans" w:hAnsi="Liberation Sans"/>
-                <w:b/>
-                <w:i w:val="0"/>
-                <w:color w:val="1B2735"/>
-                <w:sz w:val="18"/>
-                <w:rFonts w:ascii="Liberation Sans" w:hAnsi="Liberation Sans" w:cs="Liberation Sans"/>
-              </w:rPr>
-              <w:t>First finance hire.</w:t>
-            </w:r>
-            <w:r>
-              <w:rPr>
-                <w:rFonts w:ascii="Liberation Sans" w:hAnsi="Liberation Sans"/>
                 <w:b w:val="0"/>
                 <w:i w:val="0"/>
                 <w:color w:val="2E3A46"/>
-                <w:sz w:val="18"/>
+                <w:sz w:val="17"/>
                 <w:rFonts w:ascii="Liberation Sans" w:hAnsi="Liberation Sans" w:cs="Liberation Sans"/>
               </w:rPr>
-              <w:t xml:space="preserve"> Built the entire function from scratch and remain the sole senior finance leader across FP&amp;A, Accounting, Revenue Operations, and Compliance.</w:t>
+              <w:t>First finance hire; built the entire function from zero and run it as sole senior leader across FP&amp;A, Accounting, Revenue Operations, Compliance, and Treasury for a Series B fintech running U.S. and Israeli entities.</w:t>
             </w:r>
           </w:p>
           <w:p>
             <w:pPr>
               <w:widowControl w:val="0"/>
-              <w:spacing w:before="0" w:after="64" w:line="269" w:lineRule="auto"/>
+              <w:spacing w:before="0" w:after="48" w:line="254" w:lineRule="auto"/>
               <w:ind w:left="187" w:hanging="187"/>
             </w:pPr>
             <w:r>
@@ -1016,7 +863,7 @@
                 <w:b w:val="0"/>
                 <w:i w:val="0"/>
                 <w:color w:val="2E3A46"/>
-                <w:sz w:val="18"/>
+                <w:sz w:val="17"/>
                 <w:rFonts w:ascii="Liberation Sans" w:hAnsi="Liberation Sans" w:cs="Liberation Sans"/>
               </w:rPr>
               <w:t xml:space="preserve">– </w:t>
@@ -1024,30 +871,19 @@
             <w:r>
               <w:rPr>
                 <w:rFonts w:ascii="Liberation Sans" w:hAnsi="Liberation Sans"/>
-                <w:b/>
-                <w:i w:val="0"/>
-                <w:color w:val="1B2735"/>
-                <w:sz w:val="18"/>
-                <w:rFonts w:ascii="Liberation Sans" w:hAnsi="Liberation Sans" w:cs="Liberation Sans"/>
-              </w:rPr>
-              <w:t>Close: 31 days to 5.</w:t>
-            </w:r>
-            <w:r>
-              <w:rPr>
-                <w:rFonts w:ascii="Liberation Sans" w:hAnsi="Liberation Sans"/>
                 <w:b w:val="0"/>
                 <w:i w:val="0"/>
                 <w:color w:val="2E3A46"/>
-                <w:sz w:val="18"/>
+                <w:sz w:val="17"/>
                 <w:rFonts w:ascii="Liberation Sans" w:hAnsi="Liberation Sans" w:cs="Liberation Sans"/>
               </w:rPr>
-              <w:t xml:space="preserve"> Cut month-end close from 31 days to 7 in four months while running a Series B, then to 5 days by year-end 2025.</w:t>
+              <w:t>Compressed month-end close from 31 days to 7 within four months and to 5 by year-end 2025, and delivered april's first-ever consolidated U.S.–Israel financials — migrating the company onto Campfire in 48 hours against a 2–6 month industry benchmark.</w:t>
             </w:r>
           </w:p>
           <w:p>
             <w:pPr>
               <w:widowControl w:val="0"/>
-              <w:spacing w:before="0" w:after="64" w:line="269" w:lineRule="auto"/>
+              <w:spacing w:before="0" w:after="48" w:line="254" w:lineRule="auto"/>
               <w:ind w:left="187" w:hanging="187"/>
             </w:pPr>
             <w:r>
@@ -1056,7 +892,7 @@
                 <w:b w:val="0"/>
                 <w:i w:val="0"/>
                 <w:color w:val="2E3A46"/>
-                <w:sz w:val="18"/>
+                <w:sz w:val="17"/>
                 <w:rFonts w:ascii="Liberation Sans" w:hAnsi="Liberation Sans" w:cs="Liberation Sans"/>
               </w:rPr>
               <w:t xml:space="preserve">– </w:t>
@@ -1064,30 +900,19 @@
             <w:r>
               <w:rPr>
                 <w:rFonts w:ascii="Liberation Sans" w:hAnsi="Liberation Sans"/>
-                <w:b/>
-                <w:i w:val="0"/>
-                <w:color w:val="1B2735"/>
-                <w:sz w:val="18"/>
-                <w:rFonts w:ascii="Liberation Sans" w:hAnsi="Liberation Sans" w:cs="Liberation Sans"/>
-              </w:rPr>
-              <w:t>Back-to-back clean audits.</w:t>
-            </w:r>
-            <w:r>
-              <w:rPr>
-                <w:rFonts w:ascii="Liberation Sans" w:hAnsi="Liberation Sans"/>
                 <w:b w:val="0"/>
                 <w:i w:val="0"/>
                 <w:color w:val="2E3A46"/>
-                <w:sz w:val="18"/>
+                <w:sz w:val="17"/>
                 <w:rFonts w:ascii="Liberation Sans" w:hAnsi="Liberation Sans" w:cs="Liberation Sans"/>
               </w:rPr>
-              <w:t xml:space="preserve"> Led april through its first-ever KPMG audit to a clean opinion, then repeated it successfully the following year.</w:t>
+              <w:t>Moved accounting from outsourced and consultant-dependent to fully in-house — closing the 2024 books, resolving intercompany, deferred revenue, and AP/AR cleanup, running a 2024 revenue restatement, and authoring the technical accounting library (ASC 606, 842, 810, 830, 718) — while offboarding a $144K/yr fractional CFO and $88.5K/yr outsourced FP&amp;A, consolidating four tax and audit firms into one, and hiring the Accounting Manager and Staff Accountant who replaced them.</w:t>
             </w:r>
           </w:p>
           <w:p>
             <w:pPr>
               <w:widowControl w:val="0"/>
-              <w:spacing w:before="0" w:after="64" w:line="269" w:lineRule="auto"/>
+              <w:spacing w:before="0" w:after="48" w:line="254" w:lineRule="auto"/>
               <w:ind w:left="187" w:hanging="187"/>
             </w:pPr>
             <w:r>
@@ -1096,7 +921,7 @@
                 <w:b w:val="0"/>
                 <w:i w:val="0"/>
                 <w:color w:val="2E3A46"/>
-                <w:sz w:val="18"/>
+                <w:sz w:val="17"/>
                 <w:rFonts w:ascii="Liberation Sans" w:hAnsi="Liberation Sans" w:cs="Liberation Sans"/>
               </w:rPr>
               <w:t xml:space="preserve">– </w:t>
@@ -1104,30 +929,19 @@
             <w:r>
               <w:rPr>
                 <w:rFonts w:ascii="Liberation Sans" w:hAnsi="Liberation Sans"/>
-                <w:b/>
-                <w:i w:val="0"/>
-                <w:color w:val="1B2735"/>
-                <w:sz w:val="18"/>
-                <w:rFonts w:ascii="Liberation Sans" w:hAnsi="Liberation Sans" w:cs="Liberation Sans"/>
-              </w:rPr>
-              <w:t>Compliance owner.</w:t>
-            </w:r>
-            <w:r>
-              <w:rPr>
-                <w:rFonts w:ascii="Liberation Sans" w:hAnsi="Liberation Sans"/>
                 <w:b w:val="0"/>
                 <w:i w:val="0"/>
                 <w:color w:val="2E3A46"/>
-                <w:sz w:val="18"/>
+                <w:sz w:val="17"/>
                 <w:rFonts w:ascii="Liberation Sans" w:hAnsi="Liberation Sans" w:cs="Liberation Sans"/>
               </w:rPr>
-              <w:t xml:space="preserve"> Ran the SOC 1 audit independently; supported the SOC 2 Type II program, security and data-privacy reviews, vendor risk, and enterprise diligence for regulated financial-institution customers.</w:t>
+              <w:t>Led april through its first-ever KPMG audit to a clean opinion and repeated it the following year; ran the SOC 1 audit independently, supported SOC 2 Type II, and stood up risk governance — Risk Committee charter, controls documentation, and the policy library behind enterprise diligence for regulated financial-institution customers.</w:t>
             </w:r>
           </w:p>
           <w:p>
             <w:pPr>
               <w:widowControl w:val="0"/>
-              <w:spacing w:before="0" w:after="64" w:line="269" w:lineRule="auto"/>
+              <w:spacing w:before="0" w:after="48" w:line="254" w:lineRule="auto"/>
               <w:ind w:left="187" w:hanging="187"/>
             </w:pPr>
             <w:r>
@@ -1136,7 +950,7 @@
                 <w:b w:val="0"/>
                 <w:i w:val="0"/>
                 <w:color w:val="2E3A46"/>
-                <w:sz w:val="18"/>
+                <w:sz w:val="17"/>
                 <w:rFonts w:ascii="Liberation Sans" w:hAnsi="Liberation Sans" w:cs="Liberation Sans"/>
               </w:rPr>
               <w:t xml:space="preserve">– </w:t>
@@ -1144,30 +958,19 @@
             <w:r>
               <w:rPr>
                 <w:rFonts w:ascii="Liberation Sans" w:hAnsi="Liberation Sans"/>
-                <w:b/>
-                <w:i w:val="0"/>
-                <w:color w:val="1B2735"/>
-                <w:sz w:val="18"/>
-                <w:rFonts w:ascii="Liberation Sans" w:hAnsi="Liberation Sans" w:cs="Liberation Sans"/>
-              </w:rPr>
-              <w:t>AI-native finance stack.</w:t>
-            </w:r>
-            <w:r>
-              <w:rPr>
-                <w:rFonts w:ascii="Liberation Sans" w:hAnsi="Liberation Sans"/>
                 <w:b w:val="0"/>
                 <w:i w:val="0"/>
                 <w:color w:val="2E3A46"/>
-                <w:sz w:val="18"/>
+                <w:sz w:val="17"/>
                 <w:rFonts w:ascii="Liberation Sans" w:hAnsi="Liberation Sans" w:cs="Liberation Sans"/>
               </w:rPr>
-              <w:t xml:space="preserve"> Built a growing library of AI agents on the stack — including Invoice Butler, an AI-driven AR collections engine, and a Compliance Agent Ecosystem automating security and vendor-risk questionnaires — and implemented Campfire and Ramp with the team.</w:t>
+              <w:t>Implemented ten core platforms — Campfire, Ramp, Runway, Drivetrain, Anrok, Growfin, Guideline, QuotaPath, Thoropass, and Safebase — rebuilding ASC 606 billing and revenue recognition, AP and procurement controls, automated multi-jurisdiction sales tax, collections, commissions, and trust infrastructure.</w:t>
             </w:r>
           </w:p>
           <w:p>
             <w:pPr>
               <w:widowControl w:val="0"/>
-              <w:spacing w:before="0" w:after="64" w:line="269" w:lineRule="auto"/>
+              <w:spacing w:before="0" w:after="48" w:line="254" w:lineRule="auto"/>
               <w:ind w:left="187" w:hanging="187"/>
             </w:pPr>
             <w:r>
@@ -1176,7 +979,7 @@
                 <w:b w:val="0"/>
                 <w:i w:val="0"/>
                 <w:color w:val="2E3A46"/>
-                <w:sz w:val="18"/>
+                <w:sz w:val="17"/>
                 <w:rFonts w:ascii="Liberation Sans" w:hAnsi="Liberation Sans" w:cs="Liberation Sans"/>
               </w:rPr>
               <w:t xml:space="preserve">– </w:t>
@@ -1184,13 +987,31 @@
             <w:r>
               <w:rPr>
                 <w:rFonts w:ascii="Liberation Sans" w:hAnsi="Liberation Sans"/>
-                <w:b/>
+                <w:b w:val="0"/>
                 <w:i w:val="0"/>
-                <w:color w:val="1B2735"/>
-                <w:sz w:val="18"/>
+                <w:color w:val="2E3A46"/>
+                <w:sz w:val="17"/>
                 <w:rFonts w:ascii="Liberation Sans" w:hAnsi="Liberation Sans" w:cs="Liberation Sans"/>
               </w:rPr>
-              <w:t>Board &amp; capital.</w:t>
+              <w:t>Built FP&amp;A as an operating system: three-statement model, ARR waterfall and snowball, sales-capacity and headcount models, unit economics, and driver-based scenarios fed by HubSpot, Campfire, and GCP — the board's primary forecasting reference and the basis for april's $40M Series B and Series C readiness.</w:t>
+            </w:r>
+          </w:p>
+          <w:p>
+            <w:pPr>
+              <w:widowControl w:val="0"/>
+              <w:spacing w:before="0" w:after="48" w:line="254" w:lineRule="auto"/>
+              <w:ind w:left="187" w:hanging="187"/>
+            </w:pPr>
+            <w:r>
+              <w:rPr>
+                <w:rFonts w:ascii="Liberation Sans" w:hAnsi="Liberation Sans"/>
+                <w:b w:val="0"/>
+                <w:i w:val="0"/>
+                <w:color w:val="2E3A46"/>
+                <w:sz w:val="17"/>
+                <w:rFonts w:ascii="Liberation Sans" w:hAnsi="Liberation Sans" w:cs="Liberation Sans"/>
+              </w:rPr>
+              <w:t xml:space="preserve">– </w:t>
             </w:r>
             <w:r>
               <w:rPr>
@@ -1198,10 +1019,39 @@
                 <w:b w:val="0"/>
                 <w:i w:val="0"/>
                 <w:color w:val="2E3A46"/>
-                <w:sz w:val="18"/>
+                <w:sz w:val="17"/>
                 <w:rFonts w:ascii="Liberation Sans" w:hAnsi="Liberation Sans" w:cs="Liberation Sans"/>
               </w:rPr>
-              <w:t xml:space="preserve"> Built the first bottoms-up revenue model (ARR, CARR, bookings), now the board's primary forecasting reference, and the forecasting behind april's $40M Series B; delivers board packages and investor updates independently.</w:t>
+              <w:t>Built the people infrastructure behind a scaling finance org: compensation and equity philosophy, career ladders and leveling guides, performance review framework, workforce planning SOP, and commission plans.</w:t>
+            </w:r>
+          </w:p>
+          <w:p>
+            <w:pPr>
+              <w:widowControl w:val="0"/>
+              <w:spacing w:before="0" w:after="48" w:line="254" w:lineRule="auto"/>
+              <w:ind w:left="187" w:hanging="187"/>
+            </w:pPr>
+            <w:r>
+              <w:rPr>
+                <w:rFonts w:ascii="Liberation Sans" w:hAnsi="Liberation Sans"/>
+                <w:b w:val="0"/>
+                <w:i w:val="0"/>
+                <w:color w:val="2E3A46"/>
+                <w:sz w:val="17"/>
+                <w:rFonts w:ascii="Liberation Sans" w:hAnsi="Liberation Sans" w:cs="Liberation Sans"/>
+              </w:rPr>
+              <w:t xml:space="preserve">– </w:t>
+            </w:r>
+            <w:r>
+              <w:rPr>
+                <w:rFonts w:ascii="Liberation Sans" w:hAnsi="Liberation Sans"/>
+                <w:b w:val="0"/>
+                <w:i w:val="0"/>
+                <w:color w:val="2E3A46"/>
+                <w:sz w:val="17"/>
+                <w:rFonts w:ascii="Liberation Sans" w:hAnsi="Liberation Sans" w:cs="Liberation Sans"/>
+              </w:rPr>
+              <w:t>Built a growing library of AI agents on top of the finance stack, including Invoice Butler, an AI-driven AR collections engine, and a Compliance Agent Ecosystem automating security and vendor-risk questionnaires.</w:t>
             </w:r>
           </w:p>
           <w:p>
@@ -1210,7 +1060,7 @@
               <w:tabs>
                 <w:tab w:pos="7834" w:val="right"/>
               </w:tabs>
-              <w:spacing w:before="150" w:after="20" w:line="240" w:lineRule="auto"/>
+              <w:spacing w:before="116" w:after="20" w:line="240" w:lineRule="auto"/>
             </w:pPr>
             <w:r>
               <w:rPr>
@@ -1218,7 +1068,7 @@
                 <w:b/>
                 <w:i w:val="0"/>
                 <w:color w:val="1B2735"/>
-                <w:sz w:val="20"/>
+                <w:sz w:val="19"/>
                 <w:rFonts w:ascii="Liberation Sans" w:hAnsi="Liberation Sans" w:cs="Liberation Sans"/>
               </w:rPr>
               <w:t>VP of Finance &amp; Operations</w:t>
@@ -1229,7 +1079,7 @@
                 <w:b w:val="0"/>
                 <w:i w:val="0"/>
                 <w:color w:val="2E3A46"/>
-                <w:sz w:val="20"/>
+                <w:sz w:val="19"/>
                 <w:rFonts w:ascii="Liberation Sans" w:hAnsi="Liberation Sans" w:cs="Liberation Sans"/>
               </w:rPr>
               <w:t xml:space="preserve">  ·  Kisi</w:t>
@@ -1240,7 +1090,7 @@
                 <w:b w:val="0"/>
                 <w:i w:val="0"/>
                 <w:color w:val="5B6B7B"/>
-                <w:sz w:val="16"/>
+                <w:sz w:val="15"/>
                 <w:rFonts w:ascii="Liberation Sans" w:hAnsi="Liberation Sans" w:cs="Liberation Sans"/>
               </w:rPr>
               <w:tab/>
@@ -1250,7 +1100,7 @@
           <w:p>
             <w:pPr>
               <w:widowControl w:val="0"/>
-              <w:spacing w:before="0" w:after="64" w:line="269" w:lineRule="auto"/>
+              <w:spacing w:before="0" w:after="48" w:line="254" w:lineRule="auto"/>
               <w:ind w:left="187" w:hanging="187"/>
             </w:pPr>
             <w:r>
@@ -1259,7 +1109,7 @@
                 <w:b w:val="0"/>
                 <w:i w:val="0"/>
                 <w:color w:val="2E3A46"/>
-                <w:sz w:val="18"/>
+                <w:sz w:val="17"/>
                 <w:rFonts w:ascii="Liberation Sans" w:hAnsi="Liberation Sans" w:cs="Liberation Sans"/>
               </w:rPr>
               <w:t xml:space="preserve">– </w:t>
@@ -1270,16 +1120,16 @@
                 <w:b w:val="0"/>
                 <w:i w:val="0"/>
                 <w:color w:val="2E3A46"/>
-                <w:sz w:val="18"/>
+                <w:sz w:val="17"/>
                 <w:rFonts w:ascii="Liberation Sans" w:hAnsi="Liberation Sans" w:cs="Liberation Sans"/>
               </w:rPr>
-              <w:t>Led strategic direction across FP&amp;A, Accounting, People, Legal, Operations, and Revenue Operations; drove a 25% valuation increase and 6–8 months of added runway through net working capital and pricing optimization.</w:t>
+              <w:t>Owned strategic direction across FP&amp;A, Accounting, People, Legal, Operations, and Revenue Operations; drove a 25% valuation increase and 6–8 months of added runway within six months through net working capital and pricing optimization.</w:t>
             </w:r>
           </w:p>
           <w:p>
             <w:pPr>
               <w:widowControl w:val="0"/>
-              <w:spacing w:before="0" w:after="64" w:line="269" w:lineRule="auto"/>
+              <w:spacing w:before="0" w:after="48" w:line="254" w:lineRule="auto"/>
               <w:ind w:left="187" w:hanging="187"/>
             </w:pPr>
             <w:r>
@@ -1288,7 +1138,7 @@
                 <w:b w:val="0"/>
                 <w:i w:val="0"/>
                 <w:color w:val="2E3A46"/>
-                <w:sz w:val="18"/>
+                <w:sz w:val="17"/>
                 <w:rFonts w:ascii="Liberation Sans" w:hAnsi="Liberation Sans" w:cs="Liberation Sans"/>
               </w:rPr>
               <w:t xml:space="preserve">– </w:t>
@@ -1299,7 +1149,7 @@
                 <w:b w:val="0"/>
                 <w:i w:val="0"/>
                 <w:color w:val="2E3A46"/>
-                <w:sz w:val="18"/>
+                <w:sz w:val="17"/>
                 <w:rFonts w:ascii="Liberation Sans" w:hAnsi="Liberation Sans" w:cs="Liberation Sans"/>
               </w:rPr>
               <w:t>Ran a full-scale 2023 restatement and deployed Chargebee for accurate, timely revenue recognition; launched new GTM and pricing strategies that added 10% to net profit margin.</w:t>
@@ -1311,7 +1161,7 @@
               <w:tabs>
                 <w:tab w:pos="7834" w:val="right"/>
               </w:tabs>
-              <w:spacing w:before="150" w:after="20" w:line="240" w:lineRule="auto"/>
+              <w:spacing w:before="116" w:after="20" w:line="240" w:lineRule="auto"/>
             </w:pPr>
             <w:r>
               <w:rPr>
@@ -1319,7 +1169,7 @@
                 <w:b/>
                 <w:i w:val="0"/>
                 <w:color w:val="1B2735"/>
-                <w:sz w:val="20"/>
+                <w:sz w:val="19"/>
                 <w:rFonts w:ascii="Liberation Sans" w:hAnsi="Liberation Sans" w:cs="Liberation Sans"/>
               </w:rPr>
               <w:t>Director of Finance</w:t>
@@ -1330,7 +1180,7 @@
                 <w:b w:val="0"/>
                 <w:i w:val="0"/>
                 <w:color w:val="2E3A46"/>
-                <w:sz w:val="20"/>
+                <w:sz w:val="19"/>
                 <w:rFonts w:ascii="Liberation Sans" w:hAnsi="Liberation Sans" w:cs="Liberation Sans"/>
               </w:rPr>
               <w:t xml:space="preserve">  ·  Prime Trust</w:t>
@@ -1341,7 +1191,7 @@
                 <w:b w:val="0"/>
                 <w:i w:val="0"/>
                 <w:color w:val="5B6B7B"/>
-                <w:sz w:val="16"/>
+                <w:sz w:val="15"/>
                 <w:rFonts w:ascii="Liberation Sans" w:hAnsi="Liberation Sans" w:cs="Liberation Sans"/>
               </w:rPr>
               <w:tab/>
@@ -1351,7 +1201,7 @@
           <w:p>
             <w:pPr>
               <w:widowControl w:val="0"/>
-              <w:spacing w:before="0" w:after="64" w:line="269" w:lineRule="auto"/>
+              <w:spacing w:before="0" w:after="48" w:line="254" w:lineRule="auto"/>
               <w:ind w:left="187" w:hanging="187"/>
             </w:pPr>
             <w:r>
@@ -1360,7 +1210,7 @@
                 <w:b w:val="0"/>
                 <w:i w:val="0"/>
                 <w:color w:val="2E3A46"/>
-                <w:sz w:val="18"/>
+                <w:sz w:val="17"/>
                 <w:rFonts w:ascii="Liberation Sans" w:hAnsi="Liberation Sans" w:cs="Liberation Sans"/>
               </w:rPr>
               <w:t xml:space="preserve">– </w:t>
@@ -1371,16 +1221,16 @@
                 <w:b w:val="0"/>
                 <w:i w:val="0"/>
                 <w:color w:val="2E3A46"/>
-                <w:sz w:val="18"/>
+                <w:sz w:val="17"/>
                 <w:rFonts w:ascii="Liberation Sans" w:hAnsi="Liberation Sans" w:cs="Liberation Sans"/>
               </w:rPr>
-              <w:t>Hired as FP&amp;A Manager and promoted to Director; built the company's first FP&amp;A team and the revenue, operating, and GTM models behind its forward-looking metrics, and set the vision for Procurement, FP&amp;A, and Treasury.</w:t>
+              <w:t>Hired as FP&amp;A Manager and promoted to Director; built the company's first FP&amp;A team, set the vision for Procurement, FP&amp;A, and Treasury, and built the first revenue, operating, and GTM models plus a predictive churn model with Sales leadership using machine learning.</w:t>
             </w:r>
           </w:p>
           <w:p>
             <w:pPr>
               <w:widowControl w:val="0"/>
-              <w:spacing w:before="0" w:after="64" w:line="269" w:lineRule="auto"/>
+              <w:spacing w:before="0" w:after="48" w:line="254" w:lineRule="auto"/>
               <w:ind w:left="187" w:hanging="187"/>
             </w:pPr>
             <w:r>
@@ -1389,7 +1239,7 @@
                 <w:b w:val="0"/>
                 <w:i w:val="0"/>
                 <w:color w:val="2E3A46"/>
-                <w:sz w:val="18"/>
+                <w:sz w:val="17"/>
                 <w:rFonts w:ascii="Liberation Sans" w:hAnsi="Liberation Sans" w:cs="Liberation Sans"/>
               </w:rPr>
               <w:t xml:space="preserve">– </w:t>
@@ -1400,232 +1250,16 @@
                 <w:b w:val="0"/>
                 <w:i w:val="0"/>
                 <w:color w:val="2E3A46"/>
-                <w:sz w:val="18"/>
+                <w:sz w:val="17"/>
                 <w:rFonts w:ascii="Liberation Sans" w:hAnsi="Liberation Sans" w:cs="Liberation Sans"/>
               </w:rPr>
-              <w:t>Implemented Planful for the first three-statement forecasts and headcount planning and built the first Executive and Board dashboards in Looker; chaired a company-wide restructuring and supported the $150M Series B plus $50M in growth capital.</w:t>
+              <w:t>Implemented Planful for the first three-statement forecasts and headcount planning and built the first Executive and Board dashboards in Looker; chaired a company-wide restructuring, presented results to the Board, supported the $150M Series B, and raised an additional $50M in growth capital.</w:t>
             </w:r>
           </w:p>
           <w:p>
             <w:pPr>
               <w:widowControl w:val="0"/>
-              <w:tabs>
-                <w:tab w:pos="7834" w:val="right"/>
-              </w:tabs>
-              <w:spacing w:before="150" w:after="20" w:line="240" w:lineRule="auto"/>
-            </w:pPr>
-            <w:r>
-              <w:rPr>
-                <w:rFonts w:ascii="Liberation Sans" w:hAnsi="Liberation Sans"/>
-                <w:b/>
-                <w:i w:val="0"/>
-                <w:color w:val="1B2735"/>
-                <w:sz w:val="20"/>
-                <w:rFonts w:ascii="Liberation Sans" w:hAnsi="Liberation Sans" w:cs="Liberation Sans"/>
-              </w:rPr>
-              <w:t>Principal Financial Analyst</w:t>
-            </w:r>
-            <w:r>
-              <w:rPr>
-                <w:rFonts w:ascii="Liberation Sans" w:hAnsi="Liberation Sans"/>
-                <w:b w:val="0"/>
-                <w:i w:val="0"/>
-                <w:color w:val="2E3A46"/>
-                <w:sz w:val="20"/>
-                <w:rFonts w:ascii="Liberation Sans" w:hAnsi="Liberation Sans" w:cs="Liberation Sans"/>
-              </w:rPr>
-              <w:t xml:space="preserve">  ·  Prosper</w:t>
-            </w:r>
-            <w:r>
-              <w:rPr>
-                <w:rFonts w:ascii="Liberation Sans" w:hAnsi="Liberation Sans"/>
-                <w:b w:val="0"/>
-                <w:i w:val="0"/>
-                <w:color w:val="5B6B7B"/>
-                <w:sz w:val="16"/>
-                <w:rFonts w:ascii="Liberation Sans" w:hAnsi="Liberation Sans" w:cs="Liberation Sans"/>
-              </w:rPr>
-              <w:tab/>
-              <w:t>07/2021 – 01/2022 · San Francisco, CA</w:t>
-            </w:r>
-          </w:p>
-          <w:p>
-            <w:pPr>
-              <w:widowControl w:val="0"/>
-              <w:spacing w:before="0" w:after="64" w:line="269" w:lineRule="auto"/>
-              <w:ind w:left="187" w:hanging="187"/>
-            </w:pPr>
-            <w:r>
-              <w:rPr>
-                <w:rFonts w:ascii="Liberation Sans" w:hAnsi="Liberation Sans"/>
-                <w:b w:val="0"/>
-                <w:i w:val="0"/>
-                <w:color w:val="2E3A46"/>
-                <w:sz w:val="18"/>
-                <w:rFonts w:ascii="Liberation Sans" w:hAnsi="Liberation Sans" w:cs="Liberation Sans"/>
-              </w:rPr>
-              <w:t xml:space="preserve">– </w:t>
-            </w:r>
-            <w:r>
-              <w:rPr>
-                <w:rFonts w:ascii="Liberation Sans" w:hAnsi="Liberation Sans"/>
-                <w:b w:val="0"/>
-                <w:i w:val="0"/>
-                <w:color w:val="2E3A46"/>
-                <w:sz w:val="18"/>
-                <w:rFonts w:ascii="Liberation Sans" w:hAnsi="Liberation Sans" w:cs="Liberation Sans"/>
-              </w:rPr>
-              <w:t>Led consolidated planning and reporting across P&amp;L and cash flow with quarterly guidance and long-term forecasting; built the planning and unit-economics analysis behind Prosper's credit card launch.</w:t>
-            </w:r>
-          </w:p>
-          <w:p>
-            <w:pPr>
-              <w:widowControl w:val="0"/>
-              <w:tabs>
-                <w:tab w:pos="7834" w:val="right"/>
-              </w:tabs>
-              <w:spacing w:before="150" w:after="20" w:line="240" w:lineRule="auto"/>
-            </w:pPr>
-            <w:r>
-              <w:rPr>
-                <w:rFonts w:ascii="Liberation Sans" w:hAnsi="Liberation Sans"/>
-                <w:b/>
-                <w:i w:val="0"/>
-                <w:color w:val="1B2735"/>
-                <w:sz w:val="20"/>
-                <w:rFonts w:ascii="Liberation Sans" w:hAnsi="Liberation Sans" w:cs="Liberation Sans"/>
-              </w:rPr>
-              <w:t>FP&amp;A Manager</w:t>
-            </w:r>
-            <w:r>
-              <w:rPr>
-                <w:rFonts w:ascii="Liberation Sans" w:hAnsi="Liberation Sans"/>
-                <w:b w:val="0"/>
-                <w:i w:val="0"/>
-                <w:color w:val="2E3A46"/>
-                <w:sz w:val="20"/>
-                <w:rFonts w:ascii="Liberation Sans" w:hAnsi="Liberation Sans" w:cs="Liberation Sans"/>
-              </w:rPr>
-              <w:t xml:space="preserve">  ·  iTradeNetwork</w:t>
-            </w:r>
-            <w:r>
-              <w:rPr>
-                <w:rFonts w:ascii="Liberation Sans" w:hAnsi="Liberation Sans"/>
-                <w:b w:val="0"/>
-                <w:i w:val="0"/>
-                <w:color w:val="5B6B7B"/>
-                <w:sz w:val="16"/>
-                <w:rFonts w:ascii="Liberation Sans" w:hAnsi="Liberation Sans" w:cs="Liberation Sans"/>
-              </w:rPr>
-              <w:tab/>
-              <w:t>10/2019 – 07/2021 · San Francisco, CA</w:t>
-            </w:r>
-          </w:p>
-          <w:p>
-            <w:pPr>
-              <w:widowControl w:val="0"/>
-              <w:spacing w:before="0" w:after="64" w:line="269" w:lineRule="auto"/>
-              <w:ind w:left="187" w:hanging="187"/>
-            </w:pPr>
-            <w:r>
-              <w:rPr>
-                <w:rFonts w:ascii="Liberation Sans" w:hAnsi="Liberation Sans"/>
-                <w:b w:val="0"/>
-                <w:i w:val="0"/>
-                <w:color w:val="2E3A46"/>
-                <w:sz w:val="18"/>
-                <w:rFonts w:ascii="Liberation Sans" w:hAnsi="Liberation Sans" w:cs="Liberation Sans"/>
-              </w:rPr>
-              <w:t xml:space="preserve">– </w:t>
-            </w:r>
-            <w:r>
-              <w:rPr>
-                <w:rFonts w:ascii="Liberation Sans" w:hAnsi="Liberation Sans"/>
-                <w:b w:val="0"/>
-                <w:i w:val="0"/>
-                <w:color w:val="2E3A46"/>
-                <w:sz w:val="18"/>
-                <w:rFonts w:ascii="Liberation Sans" w:hAnsi="Liberation Sans" w:cs="Liberation Sans"/>
-              </w:rPr>
-              <w:t>Managed revenue and EBITDA forecasts with variance analysis for the C-suite; built the first functional-cost model and implemented Planful, cutting close time 50%.</w:t>
-            </w:r>
-          </w:p>
-          <w:p>
-            <w:pPr>
-              <w:widowControl w:val="0"/>
-              <w:tabs>
-                <w:tab w:pos="7834" w:val="right"/>
-              </w:tabs>
-              <w:spacing w:before="150" w:after="20" w:line="240" w:lineRule="auto"/>
-            </w:pPr>
-            <w:r>
-              <w:rPr>
-                <w:rFonts w:ascii="Liberation Sans" w:hAnsi="Liberation Sans"/>
-                <w:b/>
-                <w:i w:val="0"/>
-                <w:color w:val="1B2735"/>
-                <w:sz w:val="20"/>
-                <w:rFonts w:ascii="Liberation Sans" w:hAnsi="Liberation Sans" w:cs="Liberation Sans"/>
-              </w:rPr>
-              <w:t>Senior Finance Analyst</w:t>
-            </w:r>
-            <w:r>
-              <w:rPr>
-                <w:rFonts w:ascii="Liberation Sans" w:hAnsi="Liberation Sans"/>
-                <w:b w:val="0"/>
-                <w:i w:val="0"/>
-                <w:color w:val="2E3A46"/>
-                <w:sz w:val="20"/>
-                <w:rFonts w:ascii="Liberation Sans" w:hAnsi="Liberation Sans" w:cs="Liberation Sans"/>
-              </w:rPr>
-              <w:t xml:space="preserve">  ·  MightyHive</w:t>
-            </w:r>
-            <w:r>
-              <w:rPr>
-                <w:rFonts w:ascii="Liberation Sans" w:hAnsi="Liberation Sans"/>
-                <w:b w:val="0"/>
-                <w:i w:val="0"/>
-                <w:color w:val="5B6B7B"/>
-                <w:sz w:val="16"/>
-                <w:rFonts w:ascii="Liberation Sans" w:hAnsi="Liberation Sans" w:cs="Liberation Sans"/>
-              </w:rPr>
-              <w:tab/>
-              <w:t>05/2018 – 10/2019 · San Francisco, CA</w:t>
-            </w:r>
-          </w:p>
-          <w:p>
-            <w:pPr>
-              <w:widowControl w:val="0"/>
-              <w:spacing w:before="0" w:after="64" w:line="269" w:lineRule="auto"/>
-              <w:ind w:left="187" w:hanging="187"/>
-            </w:pPr>
-            <w:r>
-              <w:rPr>
-                <w:rFonts w:ascii="Liberation Sans" w:hAnsi="Liberation Sans"/>
-                <w:b w:val="0"/>
-                <w:i w:val="0"/>
-                <w:color w:val="2E3A46"/>
-                <w:sz w:val="18"/>
-                <w:rFonts w:ascii="Liberation Sans" w:hAnsi="Liberation Sans" w:cs="Liberation Sans"/>
-              </w:rPr>
-              <w:t xml:space="preserve">– </w:t>
-            </w:r>
-            <w:r>
-              <w:rPr>
-                <w:rFonts w:ascii="Liberation Sans" w:hAnsi="Liberation Sans"/>
-                <w:b w:val="0"/>
-                <w:i w:val="0"/>
-                <w:color w:val="2E3A46"/>
-                <w:sz w:val="18"/>
-                <w:rFonts w:ascii="Liberation Sans" w:hAnsi="Liberation Sans" w:cs="Liberation Sans"/>
-              </w:rPr>
-              <w:t>Led global billing through hypergrowth from $100M to $1B in revenue; global finance partner through the $150M public merger with S4 Capital, overseeing accounting, consolidations, close, and treasury on NetSuite under US GAAP.</w:t>
-            </w:r>
-          </w:p>
-          <w:p>
-            <w:pPr>
-              <w:widowControl w:val="0"/>
-              <w:spacing w:before="220" w:after="68" w:line="240" w:lineRule="auto"/>
+              <w:spacing w:before="160" w:after="68" w:line="240" w:lineRule="auto"/>
               <w:pBdr>
                 <w:bottom w:val="single" w:sz="6" w:space="2" w:color="C3CDD7"/>
               </w:pBdr>
@@ -1636,7 +1270,7 @@
                 <w:b/>
                 <w:i w:val="0"/>
                 <w:color w:val="1B2735"/>
-                <w:sz w:val="18"/>
+                <w:sz w:val="17"/>
                 <w:rFonts w:ascii="Liberation Sans" w:hAnsi="Liberation Sans" w:cs="Liberation Sans"/>
                 <w:spacing w:val="30"/>
               </w:rPr>
@@ -1646,7 +1280,7 @@
           <w:p>
             <w:pPr>
               <w:widowControl w:val="0"/>
-              <w:spacing w:before="0" w:after="64" w:line="269" w:lineRule="auto"/>
+              <w:spacing w:before="0" w:after="48" w:line="254" w:lineRule="auto"/>
             </w:pPr>
             <w:r>
               <w:rPr>
@@ -1654,7 +1288,91 @@
                 <w:b/>
                 <w:i w:val="0"/>
                 <w:color w:val="1B2735"/>
-                <w:sz w:val="18"/>
+                <w:sz w:val="17"/>
+                <w:rFonts w:ascii="Liberation Sans" w:hAnsi="Liberation Sans" w:cs="Liberation Sans"/>
+              </w:rPr>
+              <w:t xml:space="preserve">Principal Financial Analyst, Prosper (2021 – 2022). </w:t>
+            </w:r>
+            <w:r>
+              <w:rPr>
+                <w:rFonts w:ascii="Liberation Sans" w:hAnsi="Liberation Sans"/>
+                <w:b w:val="0"/>
+                <w:i w:val="0"/>
+                <w:color w:val="2E3A46"/>
+                <w:sz w:val="17"/>
+                <w:rFonts w:ascii="Liberation Sans" w:hAnsi="Liberation Sans" w:cs="Liberation Sans"/>
+              </w:rPr>
+              <w:t>Consolidated planning across P&amp;L and cash flow; built the unit economics behind Prosper's credit card launch.</w:t>
+            </w:r>
+          </w:p>
+          <w:p>
+            <w:pPr>
+              <w:widowControl w:val="0"/>
+              <w:spacing w:before="0" w:after="48" w:line="254" w:lineRule="auto"/>
+            </w:pPr>
+            <w:r>
+              <w:rPr>
+                <w:rFonts w:ascii="Liberation Sans" w:hAnsi="Liberation Sans"/>
+                <w:b/>
+                <w:i w:val="0"/>
+                <w:color w:val="1B2735"/>
+                <w:sz w:val="17"/>
+                <w:rFonts w:ascii="Liberation Sans" w:hAnsi="Liberation Sans" w:cs="Liberation Sans"/>
+              </w:rPr>
+              <w:t xml:space="preserve">FP&amp;A Manager, iTradeNetwork (2019 – 2021). </w:t>
+            </w:r>
+            <w:r>
+              <w:rPr>
+                <w:rFonts w:ascii="Liberation Sans" w:hAnsi="Liberation Sans"/>
+                <w:b w:val="0"/>
+                <w:i w:val="0"/>
+                <w:color w:val="2E3A46"/>
+                <w:sz w:val="17"/>
+                <w:rFonts w:ascii="Liberation Sans" w:hAnsi="Liberation Sans" w:cs="Liberation Sans"/>
+              </w:rPr>
+              <w:t>Owned revenue and EBITDA forecasting for the C-suite; built the first functional-cost model and implemented Planful, cutting close 50%.</w:t>
+            </w:r>
+          </w:p>
+          <w:p>
+            <w:pPr>
+              <w:widowControl w:val="0"/>
+              <w:spacing w:before="0" w:after="48" w:line="254" w:lineRule="auto"/>
+            </w:pPr>
+            <w:r>
+              <w:rPr>
+                <w:rFonts w:ascii="Liberation Sans" w:hAnsi="Liberation Sans"/>
+                <w:b/>
+                <w:i w:val="0"/>
+                <w:color w:val="1B2735"/>
+                <w:sz w:val="17"/>
+                <w:rFonts w:ascii="Liberation Sans" w:hAnsi="Liberation Sans" w:cs="Liberation Sans"/>
+              </w:rPr>
+              <w:t xml:space="preserve">Senior Finance Analyst, MightyHive (2018 – 2019). </w:t>
+            </w:r>
+            <w:r>
+              <w:rPr>
+                <w:rFonts w:ascii="Liberation Sans" w:hAnsi="Liberation Sans"/>
+                <w:b w:val="0"/>
+                <w:i w:val="0"/>
+                <w:color w:val="2E3A46"/>
+                <w:sz w:val="17"/>
+                <w:rFonts w:ascii="Liberation Sans" w:hAnsi="Liberation Sans" w:cs="Liberation Sans"/>
+              </w:rPr>
+              <w:t>Ran global billing through $100M-to-$1B hypergrowth; finance partner on the $150M public merger with S4 Capital, overseeing consolidations and treasury on NetSuite under US GAAP.</w:t>
+            </w:r>
+          </w:p>
+          <w:p>
+            <w:pPr>
+              <w:widowControl w:val="0"/>
+              <w:spacing w:before="0" w:after="48" w:line="254" w:lineRule="auto"/>
+            </w:pPr>
+            <w:r>
+              <w:rPr>
+                <w:rFonts w:ascii="Liberation Sans" w:hAnsi="Liberation Sans"/>
+                <w:b/>
+                <w:i w:val="0"/>
+                <w:color w:val="1B2735"/>
+                <w:sz w:val="17"/>
                 <w:rFonts w:ascii="Liberation Sans" w:hAnsi="Liberation Sans" w:cs="Liberation Sans"/>
               </w:rPr>
               <w:t xml:space="preserve">Controller, Harvard Eye Associates (2016 – 2018). </w:t>
@@ -1665,7 +1383,7 @@
                 <w:b w:val="0"/>
                 <w:i w:val="0"/>
                 <w:color w:val="2E3A46"/>
-                <w:sz w:val="18"/>
+                <w:sz w:val="17"/>
                 <w:rFonts w:ascii="Liberation Sans" w:hAnsi="Liberation Sans" w:cs="Liberation Sans"/>
               </w:rPr>
               <w:t>Led due diligence for a $78M PE acquisition; lowered AR days 72%, moving cash flow from negative $1.2M to positive $650K.</w:t>
@@ -1674,7 +1392,7 @@
           <w:p>
             <w:pPr>
               <w:widowControl w:val="0"/>
-              <w:spacing w:before="0" w:after="64" w:line="269" w:lineRule="auto"/>
+              <w:spacing w:before="0" w:after="48" w:line="254" w:lineRule="auto"/>
             </w:pPr>
             <w:r>
               <w:rPr>
@@ -1682,7 +1400,7 @@
                 <w:b/>
                 <w:i w:val="0"/>
                 <w:color w:val="1B2735"/>
-                <w:sz w:val="18"/>
+                <w:sz w:val="17"/>
                 <w:rFonts w:ascii="Liberation Sans" w:hAnsi="Liberation Sans" w:cs="Liberation Sans"/>
               </w:rPr>
               <w:t xml:space="preserve">Practice Administrator, Retina Consultants of Nevada (2013 – 2016). </w:t>
@@ -1693,10 +1411,10 @@
                 <w:b w:val="0"/>
                 <w:i w:val="0"/>
                 <w:color w:val="2E3A46"/>
-                <w:sz w:val="18"/>
+                <w:sz w:val="17"/>
                 <w:rFonts w:ascii="Liberation Sans" w:hAnsi="Liberation Sans" w:cs="Liberation Sans"/>
               </w:rPr>
-              <w:t>Ran operations for a six-office, 90+ FTE practice; grew revenue from $12M to $15M and reduced denials 35%.</w:t>
+              <w:t>Ran a six-office, 90+ FTE practice; grew revenue from $12M to $15M and reduced denials 35%.</w:t>
             </w:r>
           </w:p>
         </w:tc>

</xml_diff>

<commit_message>
Remove em dashes from resume copy
Rewrote each construction with the punctuation the sentence actually wanted
(colon, semicolon, comma, parentheses, or a sentence split) rather than
swapping the character. Also replaced the em dash separating the AI-system
title from its tagline with the interpunct already used on role lines.

Co-Authored-By: Claude Opus 5 <noreply@anthropic.com>
Claude-Session: https://claude.ai/code/session_016j5nAUmtmieWeSYgPNt7oe
</commit_message>
<xml_diff>
--- a/resume/out/Erik_Leavell_Resume.docx
+++ b/resume/out/Erik_Leavell_Resume.docx
@@ -755,7 +755,7 @@
                 <w:sz w:val="17"/>
                 <w:rFonts w:ascii="Liberation Sans" w:hAnsi="Liberation Sans" w:cs="Liberation Sans"/>
               </w:rPr>
-              <w:t>Finance executive who builds finance functions that scale. I run FP&amp;A, Accounting, Revenue Operations, and Compliance at april as its sole senior finance leader — a function I built from zero as the company's first finance hire. Ten-plus years across SaaS and fintech: GAAP accounting and audit-ready governance stood up from scratch, global consolidations delivered, $250M+ in capital supported, and manual, vendor-dependent operations replaced with automated systems that run leaner than the headcount they displace.</w:t>
+              <w:t>Finance executive who builds finance functions that scale. I run FP&amp;A, Accounting, Revenue Operations, and Compliance at april as its sole senior finance leader, a function I built from zero as the company's first finance hire. Ten-plus years across SaaS and fintech: GAAP accounting and audit-ready governance stood up from scratch, global consolidations delivered, $250M+ in capital supported, and manual, vendor-dependent operations replaced with automated systems that run leaner than the headcount they displace.</w:t>
             </w:r>
           </w:p>
           <w:p>
@@ -877,7 +877,7 @@
                 <w:sz w:val="17"/>
                 <w:rFonts w:ascii="Liberation Sans" w:hAnsi="Liberation Sans" w:cs="Liberation Sans"/>
               </w:rPr>
-              <w:t>Compressed month-end close from 31 days to 7 within four months and to 5 by year-end 2025, and delivered april's first-ever consolidated U.S.–Israel financials — migrating the company onto Campfire in 48 hours against a 2–6 month industry benchmark.</w:t>
+              <w:t>Compressed month-end close from 31 days to 7 within four months and to 5 by year-end 2025, and delivered april's first-ever consolidated U.S.–Israel financials, migrating the company onto Campfire in 48 hours against a 2–6 month industry benchmark.</w:t>
             </w:r>
           </w:p>
           <w:p>
@@ -906,7 +906,7 @@
                 <w:sz w:val="17"/>
                 <w:rFonts w:ascii="Liberation Sans" w:hAnsi="Liberation Sans" w:cs="Liberation Sans"/>
               </w:rPr>
-              <w:t>Moved accounting from outsourced and consultant-dependent to fully in-house — closing the 2024 books, resolving intercompany, deferred revenue, and AP/AR cleanup, running a 2024 revenue restatement, and authoring the technical accounting library (ASC 606, 842, 810, 830, 718) — while offboarding a $144K/yr fractional CFO and $88.5K/yr outsourced FP&amp;A, consolidating four tax and audit firms into one, and hiring the Accounting Manager and Staff Accountant who replaced them.</w:t>
+              <w:t>Moved accounting from outsourced and consultant-dependent to fully in-house: closed the 2024 books, resolved intercompany, deferred revenue, and AP/AR cleanup, ran a 2024 revenue restatement, and authored the technical accounting library (ASC 606, 842, 810, 830, 718), all while offboarding a $144K/yr fractional CFO and $88.5K/yr outsourced FP&amp;A, consolidating four tax and audit firms into one, and hiring the Accounting Manager and Staff Accountant who replaced them.</w:t>
             </w:r>
           </w:p>
           <w:p>
@@ -935,7 +935,7 @@
                 <w:sz w:val="17"/>
                 <w:rFonts w:ascii="Liberation Sans" w:hAnsi="Liberation Sans" w:cs="Liberation Sans"/>
               </w:rPr>
-              <w:t>Led april through its first-ever KPMG audit to a clean opinion and repeated it the following year; ran the SOC 1 audit independently, supported SOC 2 Type II, and stood up risk governance — Risk Committee charter, controls documentation, and the policy library behind enterprise diligence for regulated financial-institution customers.</w:t>
+              <w:t>Led april through its first-ever KPMG audit to a clean opinion and repeated it the following year; ran the SOC 1 audit independently, supported SOC 2 Type II, and stood up risk governance: Risk Committee charter, controls documentation, and the policy library behind enterprise diligence for regulated financial-institution customers.</w:t>
             </w:r>
           </w:p>
           <w:p>
@@ -964,7 +964,7 @@
                 <w:sz w:val="17"/>
                 <w:rFonts w:ascii="Liberation Sans" w:hAnsi="Liberation Sans" w:cs="Liberation Sans"/>
               </w:rPr>
-              <w:t>Implemented ten core platforms — Campfire, Ramp, Runway, Drivetrain, Anrok, Growfin, Guideline, QuotaPath, Thoropass, and Safebase — rebuilding ASC 606 billing and revenue recognition, AP and procurement controls, automated multi-jurisdiction sales tax, collections, commissions, and trust infrastructure.</w:t>
+              <w:t>Implemented ten core platforms (Campfire, Ramp, Runway, Drivetrain, Anrok, Growfin, Guideline, QuotaPath, Thoropass, and Safebase), rebuilding ASC 606 billing and revenue recognition, AP and procurement controls, automated multi-jurisdiction sales tax, collections, commissions, and trust infrastructure.</w:t>
             </w:r>
           </w:p>
           <w:p>
@@ -993,7 +993,7 @@
                 <w:sz w:val="17"/>
                 <w:rFonts w:ascii="Liberation Sans" w:hAnsi="Liberation Sans" w:cs="Liberation Sans"/>
               </w:rPr>
-              <w:t>Built FP&amp;A as an operating system: three-statement model, ARR waterfall and snowball, sales-capacity and headcount models, unit economics, and driver-based scenarios fed by HubSpot, Campfire, and GCP — the board's primary forecasting reference and the basis for april's $40M Series B and Series C readiness.</w:t>
+              <w:t>Built FP&amp;A as an operating system: three-statement model, ARR waterfall and snowball, sales-capacity and headcount models, unit economics, and driver-based scenarios fed by HubSpot, Campfire, and GCP; the board's primary forecasting reference and the basis for april's $40M Series B and Series C readiness.</w:t>
             </w:r>
           </w:p>
           <w:p>

</xml_diff>

<commit_message>
Restore By the Numbers block, drop Languages (finance resume)
Adds the six-metric highlight block to the finance sidebar per request and
removes the Languages section to make room. Sidebar now ends at 94.7% of
the page against the main column's 95.7%, still one page with no clipping.

The Abacum variant is unchanged and keeps its Languages section.

Co-Authored-By: Claude Opus 5 <noreply@anthropic.com>
Claude-Session: https://claude.ai/code/session_016j5nAUmtmieWeSYgPNt7oe
</commit_message>
<xml_diff>
--- a/resume/out/Erik_Leavell_Resume.docx
+++ b/resume/out/Erik_Leavell_Resume.docx
@@ -371,6 +371,195 @@
                 <w:rFonts w:ascii="Liberation Sans" w:hAnsi="Liberation Sans" w:cs="Liberation Sans"/>
                 <w:spacing w:val="24"/>
               </w:rPr>
+              <w:t>BY THE NUMBERS</w:t>
+            </w:r>
+          </w:p>
+          <w:p>
+            <w:pPr>
+              <w:widowControl w:val="0"/>
+              <w:spacing w:before="0" w:after="112" w:line="266" w:lineRule="auto"/>
+            </w:pPr>
+            <w:r>
+              <w:rPr>
+                <w:rFonts w:ascii="Liberation Sans" w:hAnsi="Liberation Sans"/>
+                <w:b/>
+                <w:i w:val="0"/>
+                <w:color w:val="FFFFFF"/>
+                <w:sz w:val="16"/>
+                <w:rFonts w:ascii="Liberation Sans" w:hAnsi="Liberation Sans" w:cs="Liberation Sans"/>
+              </w:rPr>
+              <w:t>31 → 5 days</w:t>
+            </w:r>
+            <w:r>
+              <w:rPr>
+                <w:rFonts w:ascii="Liberation Sans" w:hAnsi="Liberation Sans"/>
+                <w:b w:val="0"/>
+                <w:i w:val="0"/>
+                <w:color w:val="D9E2EC"/>
+                <w:sz w:val="16"/>
+                <w:rFonts w:ascii="Liberation Sans" w:hAnsi="Liberation Sans" w:cs="Liberation Sans"/>
+              </w:rPr>
+              <w:t xml:space="preserve"> month-end close</w:t>
+            </w:r>
+          </w:p>
+          <w:p>
+            <w:pPr>
+              <w:widowControl w:val="0"/>
+              <w:spacing w:before="0" w:after="112" w:line="266" w:lineRule="auto"/>
+            </w:pPr>
+            <w:r>
+              <w:rPr>
+                <w:rFonts w:ascii="Liberation Sans" w:hAnsi="Liberation Sans"/>
+                <w:b/>
+                <w:i w:val="0"/>
+                <w:color w:val="FFFFFF"/>
+                <w:sz w:val="16"/>
+                <w:rFonts w:ascii="Liberation Sans" w:hAnsi="Liberation Sans" w:cs="Liberation Sans"/>
+              </w:rPr>
+              <w:t>2 consecutive</w:t>
+            </w:r>
+            <w:r>
+              <w:rPr>
+                <w:rFonts w:ascii="Liberation Sans" w:hAnsi="Liberation Sans"/>
+                <w:b w:val="0"/>
+                <w:i w:val="0"/>
+                <w:color w:val="D9E2EC"/>
+                <w:sz w:val="16"/>
+                <w:rFonts w:ascii="Liberation Sans" w:hAnsi="Liberation Sans" w:cs="Liberation Sans"/>
+              </w:rPr>
+              <w:t xml:space="preserve"> clean KPMG audits</w:t>
+            </w:r>
+          </w:p>
+          <w:p>
+            <w:pPr>
+              <w:widowControl w:val="0"/>
+              <w:spacing w:before="0" w:after="112" w:line="266" w:lineRule="auto"/>
+            </w:pPr>
+            <w:r>
+              <w:rPr>
+                <w:rFonts w:ascii="Liberation Sans" w:hAnsi="Liberation Sans"/>
+                <w:b/>
+                <w:i w:val="0"/>
+                <w:color w:val="FFFFFF"/>
+                <w:sz w:val="16"/>
+                <w:rFonts w:ascii="Liberation Sans" w:hAnsi="Liberation Sans" w:cs="Liberation Sans"/>
+              </w:rPr>
+              <w:t>$250M+</w:t>
+            </w:r>
+            <w:r>
+              <w:rPr>
+                <w:rFonts w:ascii="Liberation Sans" w:hAnsi="Liberation Sans"/>
+                <w:b w:val="0"/>
+                <w:i w:val="0"/>
+                <w:color w:val="D9E2EC"/>
+                <w:sz w:val="16"/>
+                <w:rFonts w:ascii="Liberation Sans" w:hAnsi="Liberation Sans" w:cs="Liberation Sans"/>
+              </w:rPr>
+              <w:t xml:space="preserve"> raised across Series B and C</w:t>
+            </w:r>
+          </w:p>
+          <w:p>
+            <w:pPr>
+              <w:widowControl w:val="0"/>
+              <w:spacing w:before="0" w:after="112" w:line="266" w:lineRule="auto"/>
+            </w:pPr>
+            <w:r>
+              <w:rPr>
+                <w:rFonts w:ascii="Liberation Sans" w:hAnsi="Liberation Sans"/>
+                <w:b/>
+                <w:i w:val="0"/>
+                <w:color w:val="FFFFFF"/>
+                <w:sz w:val="16"/>
+                <w:rFonts w:ascii="Liberation Sans" w:hAnsi="Liberation Sans" w:cs="Liberation Sans"/>
+              </w:rPr>
+              <w:t>+25% valuation</w:t>
+            </w:r>
+            <w:r>
+              <w:rPr>
+                <w:rFonts w:ascii="Liberation Sans" w:hAnsi="Liberation Sans"/>
+                <w:b w:val="0"/>
+                <w:i w:val="0"/>
+                <w:color w:val="D9E2EC"/>
+                <w:sz w:val="16"/>
+                <w:rFonts w:ascii="Liberation Sans" w:hAnsi="Liberation Sans" w:cs="Liberation Sans"/>
+              </w:rPr>
+              <w:t xml:space="preserve"> and 6–8 months of runway</w:t>
+            </w:r>
+          </w:p>
+          <w:p>
+            <w:pPr>
+              <w:widowControl w:val="0"/>
+              <w:spacing w:before="0" w:after="112" w:line="266" w:lineRule="auto"/>
+            </w:pPr>
+            <w:r>
+              <w:rPr>
+                <w:rFonts w:ascii="Liberation Sans" w:hAnsi="Liberation Sans"/>
+                <w:b/>
+                <w:i w:val="0"/>
+                <w:color w:val="FFFFFF"/>
+                <w:sz w:val="16"/>
+                <w:rFonts w:ascii="Liberation Sans" w:hAnsi="Liberation Sans" w:cs="Liberation Sans"/>
+              </w:rPr>
+              <w:t>$100M → $1B</w:t>
+            </w:r>
+            <w:r>
+              <w:rPr>
+                <w:rFonts w:ascii="Liberation Sans" w:hAnsi="Liberation Sans"/>
+                <w:b w:val="0"/>
+                <w:i w:val="0"/>
+                <w:color w:val="D9E2EC"/>
+                <w:sz w:val="16"/>
+                <w:rFonts w:ascii="Liberation Sans" w:hAnsi="Liberation Sans" w:cs="Liberation Sans"/>
+              </w:rPr>
+              <w:t xml:space="preserve"> revenue scale-up at MightyHive</w:t>
+            </w:r>
+          </w:p>
+          <w:p>
+            <w:pPr>
+              <w:widowControl w:val="0"/>
+              <w:spacing w:before="0" w:after="112" w:line="266" w:lineRule="auto"/>
+            </w:pPr>
+            <w:r>
+              <w:rPr>
+                <w:rFonts w:ascii="Liberation Sans" w:hAnsi="Liberation Sans"/>
+                <w:b/>
+                <w:i w:val="0"/>
+                <w:color w:val="FFFFFF"/>
+                <w:sz w:val="16"/>
+                <w:rFonts w:ascii="Liberation Sans" w:hAnsi="Liberation Sans" w:cs="Liberation Sans"/>
+              </w:rPr>
+              <w:t>−72% AR days</w:t>
+            </w:r>
+            <w:r>
+              <w:rPr>
+                <w:rFonts w:ascii="Liberation Sans" w:hAnsi="Liberation Sans"/>
+                <w:b w:val="0"/>
+                <w:i w:val="0"/>
+                <w:color w:val="D9E2EC"/>
+                <w:sz w:val="16"/>
+                <w:rFonts w:ascii="Liberation Sans" w:hAnsi="Liberation Sans" w:cs="Liberation Sans"/>
+              </w:rPr>
+              <w:t xml:space="preserve"> at Harvard Eye Associates</w:t>
+            </w:r>
+          </w:p>
+          <w:p>
+            <w:pPr>
+              <w:widowControl w:val="0"/>
+              <w:spacing w:before="300" w:after="52" w:line="240" w:lineRule="auto"/>
+              <w:pBdr>
+                <w:bottom w:val="single" w:sz="4" w:space="2" w:color="3E5468"/>
+              </w:pBdr>
+            </w:pPr>
+            <w:r>
+              <w:rPr>
+                <w:rFonts w:ascii="Liberation Sans" w:hAnsi="Liberation Sans"/>
+                <w:b/>
+                <w:i w:val="0"/>
+                <w:color w:val="7FB3D9"/>
+                <w:sz w:val="16"/>
+                <w:rFonts w:ascii="Liberation Sans" w:hAnsi="Liberation Sans" w:cs="Liberation Sans"/>
+                <w:spacing w:val="24"/>
+              </w:rPr>
               <w:t>FINANCE STACK</w:t>
             </w:r>
           </w:p>
@@ -651,61 +840,6 @@
                 <w:rFonts w:ascii="Liberation Sans" w:hAnsi="Liberation Sans" w:cs="Liberation Sans"/>
               </w:rPr>
               <w:t>Brigham Young University, 2014</w:t>
-            </w:r>
-          </w:p>
-          <w:p>
-            <w:pPr>
-              <w:widowControl w:val="0"/>
-              <w:spacing w:before="300" w:after="52" w:line="240" w:lineRule="auto"/>
-              <w:pBdr>
-                <w:bottom w:val="single" w:sz="4" w:space="2" w:color="3E5468"/>
-              </w:pBdr>
-            </w:pPr>
-            <w:r>
-              <w:rPr>
-                <w:rFonts w:ascii="Liberation Sans" w:hAnsi="Liberation Sans"/>
-                <w:b/>
-                <w:i w:val="0"/>
-                <w:color w:val="7FB3D9"/>
-                <w:sz w:val="16"/>
-                <w:rFonts w:ascii="Liberation Sans" w:hAnsi="Liberation Sans" w:cs="Liberation Sans"/>
-                <w:spacing w:val="24"/>
-              </w:rPr>
-              <w:t>LANGUAGES</w:t>
-            </w:r>
-          </w:p>
-          <w:p>
-            <w:pPr>
-              <w:widowControl w:val="0"/>
-              <w:spacing w:before="0" w:after="112" w:line="266" w:lineRule="auto"/>
-            </w:pPr>
-            <w:r>
-              <w:rPr>
-                <w:rFonts w:ascii="Liberation Sans" w:hAnsi="Liberation Sans"/>
-                <w:b w:val="0"/>
-                <w:i w:val="0"/>
-                <w:color w:val="D9E2EC"/>
-                <w:sz w:val="16"/>
-                <w:rFonts w:ascii="Liberation Sans" w:hAnsi="Liberation Sans" w:cs="Liberation Sans"/>
-              </w:rPr>
-              <w:t>English (native) · Spanish (native)</w:t>
-            </w:r>
-          </w:p>
-          <w:p>
-            <w:pPr>
-              <w:widowControl w:val="0"/>
-              <w:spacing w:before="0" w:after="112" w:line="266" w:lineRule="auto"/>
-            </w:pPr>
-            <w:r>
-              <w:rPr>
-                <w:rFonts w:ascii="Liberation Sans" w:hAnsi="Liberation Sans"/>
-                <w:b w:val="0"/>
-                <w:i w:val="0"/>
-                <w:color w:val="D9E2EC"/>
-                <w:sz w:val="16"/>
-                <w:rFonts w:ascii="Liberation Sans" w:hAnsi="Liberation Sans" w:cs="Liberation Sans"/>
-              </w:rPr>
-              <w:t>Portuguese (intermediate) · ASL (proficient)</w:t>
             </w:r>
           </w:p>
         </w:tc>

</xml_diff>

<commit_message>
Swap Harvard Eye AR metric for april AR aging in numbers block
By the Numbers now shows 126 to 43 days AR aging at april in place of the
72% AR-days reduction at Harvard Eye Associates. Keeps the highlight block
weighted toward current work, and removes its overlap with the Harvard Eye
line in Earlier Experience.

Co-Authored-By: Claude Opus 5 <noreply@anthropic.com>
Claude-Session: https://claude.ai/code/session_016j5nAUmtmieWeSYgPNt7oe
</commit_message>
<xml_diff>
--- a/resume/out/Erik_Leavell_Resume.docx
+++ b/resume/out/Erik_Leavell_Resume.docx
@@ -528,7 +528,7 @@
                 <w:sz w:val="16"/>
                 <w:rFonts w:ascii="Liberation Sans" w:hAnsi="Liberation Sans" w:cs="Liberation Sans"/>
               </w:rPr>
-              <w:t>−72% AR days</w:t>
+              <w:t>126 → 43 days</w:t>
             </w:r>
             <w:r>
               <w:rPr>
@@ -539,7 +539,7 @@
                 <w:sz w:val="16"/>
                 <w:rFonts w:ascii="Liberation Sans" w:hAnsi="Liberation Sans" w:cs="Liberation Sans"/>
               </w:rPr>
-              <w:t xml:space="preserve"> at Harvard Eye Associates</w:t>
+              <w:t xml:space="preserve"> AR aging at april</w:t>
             </w:r>
           </w:p>
           <w:p>

</xml_diff>

<commit_message>
Separate company run rate from partner book in april bullets
The $25M is company-wide run rate, not the partner book, so attributing
the book's growth "to a $25M run rate" conflated two different scopes.

Company scale now appears once, in the opening scope bullet, as a $25M
run-rate Series B fintech. The pricing bullet's result is scoped to what
the pricing work actually moved: nearly doubling the partner book at
158% NRR.

Still three lines each; main column fill unchanged at 97.0%.

Co-Authored-By: Claude Opus 5 <noreply@anthropic.com>
Claude-Session: https://claude.ai/code/session_016j5nAUmtmieWeSYgPNt7oe
</commit_message>
<xml_diff>
--- a/resume/out/Erik_Leavell_Resume.docx
+++ b/resume/out/Erik_Leavell_Resume.docx
@@ -982,7 +982,7 @@
                 <w:sz w:val="17"/>
                 <w:rFonts w:ascii="Liberation Sans" w:hAnsi="Liberation Sans" w:cs="Liberation Sans"/>
               </w:rPr>
-              <w:t>First finance hire; built the entire function from zero and run it as sole senior leader across FP&amp;A, Accounting, Revenue Operations, Compliance, and Treasury for a Series B fintech running U.S. and Israeli entities.</w:t>
+              <w:t>First finance hire; built the entire function from zero and run it as sole senior leader across FP&amp;A, Accounting, Revenue Operations, Compliance, and Treasury for a $25M run-rate Series B fintech running U.S. and Israeli entities.</w:t>
             </w:r>
           </w:p>
           <w:p>
@@ -1156,7 +1156,7 @@
                 <w:sz w:val="17"/>
                 <w:rFonts w:ascii="Liberation Sans" w:hAnsi="Liberation Sans" w:cs="Liberation Sans"/>
               </w:rPr>
-              <w:t>Partnered with the CRO to rebuild pricing as a selling tool, not a rate sheet: unit economics set the gross-margin floors reps could discount freely inside, a platform fee billed on top of filing usage, and vertical bundles with worked deals, nearly doubling the book to a $25M run rate at 158% NRR.</w:t>
+              <w:t>Partnered with the CRO to rebuild pricing as a selling tool, not a rate sheet: unit economics set the gross-margin floors reps could discount freely inside, a platform fee billed on top of filing usage, and vertical bundles with worked deals, nearly doubling the partner book at 158% NRR.</w:t>
             </w:r>
           </w:p>
           <w:p>

</xml_diff>